<commit_message>
new figure 3, continued responding to reviewers
</commit_message>
<xml_diff>
--- a/Docs/00_CanJFS/R1_18062026/R1_CanJFS_MainDocument.docx
+++ b/Docs/00_CanJFS/R1_18062026/R1_CanJFS_MainDocument.docx
@@ -1174,41 +1174,175 @@
         <w:rPr>
           <w:rFonts w:ascii="Garamond" w:hAnsi="Garamond" w:cs="Times New Roman"/>
         </w:rPr>
-        <w:t xml:space="preserve">. Populations returning to the furthest upstream portions of the watershed face particular risk of overharvest given their extended migration </w:t>
-      </w:r>
-      <w:r>
-        <w:rPr>
-          <w:rFonts w:ascii="Garamond" w:hAnsi="Garamond"/>
-        </w:rPr>
-        <w:t xml:space="preserve">and sequential nature of large river salmon fisheries </w:t>
-      </w:r>
-      <w:r>
-        <w:rPr>
-          <w:rFonts w:ascii="Garamond" w:hAnsi="Garamond" w:cs="Times New Roman"/>
+        <w:t>. Populations returning to the furthest upstream portions of the watershed face particular risk of overharvest given their extended migration</w:t>
+      </w:r>
+      <w:ins w:id="31" w:author="Benjamin J. Makhlouf" w:date="2026-06-22T09:50:00Z" w16du:dateUtc="2026-06-22T16:50:00Z">
+        <w:r>
+          <w:rPr>
+            <w:rFonts w:ascii="Garamond" w:hAnsi="Garamond" w:cs="Times New Roman"/>
+          </w:rPr>
+          <w:t xml:space="preserve"> </w:t>
+        </w:r>
+      </w:ins>
+      <w:ins w:id="32" w:author="Benjamin J. Makhlouf" w:date="2026-06-22T09:53:00Z" w16du:dateUtc="2026-06-22T16:53:00Z">
+        <w:r>
+          <w:rPr>
+            <w:rFonts w:ascii="Garamond" w:hAnsi="Garamond" w:cs="Times New Roman"/>
+          </w:rPr>
+          <w:t xml:space="preserve">, </w:t>
+        </w:r>
+      </w:ins>
+      <w:ins w:id="33" w:author="Benjamin J. Makhlouf" w:date="2026-06-22T09:50:00Z" w16du:dateUtc="2026-06-22T16:50:00Z">
+        <w:r>
+          <w:rPr>
+            <w:rFonts w:ascii="Garamond" w:hAnsi="Garamond" w:cs="Times New Roman"/>
+          </w:rPr>
+          <w:t xml:space="preserve">which exposes them to </w:t>
+        </w:r>
+      </w:ins>
+      <w:ins w:id="34" w:author="Benjamin J. Makhlouf" w:date="2026-06-22T09:51:00Z" w16du:dateUtc="2026-06-22T16:51:00Z">
+        <w:r>
+          <w:rPr>
+            <w:rFonts w:ascii="Garamond" w:hAnsi="Garamond" w:cs="Times New Roman"/>
+          </w:rPr>
+          <w:t>extended fishing pressure</w:t>
+        </w:r>
+      </w:ins>
+      <w:ins w:id="35" w:author="Benjamin J. Makhlouf" w:date="2026-06-22T09:53:00Z" w16du:dateUtc="2026-06-22T16:53:00Z">
+        <w:r>
+          <w:rPr>
+            <w:rFonts w:ascii="Garamond" w:hAnsi="Garamond" w:cs="Times New Roman"/>
+          </w:rPr>
+          <w:t xml:space="preserve"> and environmental stressors throughout their return migration. </w:t>
+        </w:r>
+      </w:ins>
+      <w:ins w:id="36" w:author="Benjamin J. Makhlouf" w:date="2026-06-22T09:56:00Z" w16du:dateUtc="2026-06-22T16:56:00Z">
+        <w:r>
+          <w:rPr>
+            <w:rFonts w:ascii="Garamond" w:hAnsi="Garamond" w:cs="Times New Roman"/>
+          </w:rPr>
+          <w:t>E</w:t>
+        </w:r>
+      </w:ins>
+      <w:ins w:id="37" w:author="Benjamin J. Makhlouf" w:date="2026-06-22T09:54:00Z" w16du:dateUtc="2026-06-22T16:54:00Z">
+        <w:r>
+          <w:rPr>
+            <w:rFonts w:ascii="Garamond" w:hAnsi="Garamond" w:cs="Times New Roman"/>
+          </w:rPr>
+          <w:t>arly migrating populations with extended migration durations</w:t>
+        </w:r>
+      </w:ins>
+      <w:ins w:id="38" w:author="Benjamin J. Makhlouf" w:date="2026-06-22T09:56:00Z" w16du:dateUtc="2026-06-22T16:56:00Z">
+        <w:r>
+          <w:rPr>
+            <w:rFonts w:ascii="Garamond" w:hAnsi="Garamond" w:cs="Times New Roman"/>
+          </w:rPr>
+          <w:t xml:space="preserve"> in other systems</w:t>
+        </w:r>
+      </w:ins>
+      <w:ins w:id="39" w:author="Benjamin J. Makhlouf" w:date="2026-06-22T09:54:00Z" w16du:dateUtc="2026-06-22T16:54:00Z">
+        <w:r>
+          <w:rPr>
+            <w:rFonts w:ascii="Garamond" w:hAnsi="Garamond" w:cs="Times New Roman"/>
+          </w:rPr>
+          <w:t xml:space="preserve"> have been associated with a heightened risk of declining abundance, suggesting that upper Kuskokwim populations may face higher conservation risk </w:t>
+        </w:r>
+        <w:r>
+          <w:rPr>
+            <w:rFonts w:ascii="Garamond" w:hAnsi="Garamond" w:cs="Times New Roman"/>
+            <w:highlight w:val="yellow"/>
+            <w:rPrChange w:id="40" w:author="Benjamin J. Makhlouf" w:date="2026-06-22T09:56:00Z" w16du:dateUtc="2026-06-22T16:56:00Z">
+              <w:rPr>
+                <w:rFonts w:ascii="Garamond" w:hAnsi="Garamond" w:cs="Times New Roman"/>
+              </w:rPr>
+            </w:rPrChange>
+          </w:rPr>
+          <w:t>(Atlas et al., 2023).</w:t>
+        </w:r>
+      </w:ins>
+      <w:del w:id="41" w:author="Benjamin J. Makhlouf" w:date="2026-06-22T09:50:00Z" w16du:dateUtc="2026-06-22T16:50:00Z">
+        <w:r>
+          <w:rPr>
+            <w:rFonts w:ascii="Garamond" w:hAnsi="Garamond" w:cs="Times New Roman"/>
+            <w:highlight w:val="yellow"/>
+            <w:rPrChange w:id="42" w:author="Benjamin J. Makhlouf" w:date="2026-06-22T09:56:00Z" w16du:dateUtc="2026-06-22T16:56:00Z">
+              <w:rPr>
+                <w:rFonts w:ascii="Garamond" w:hAnsi="Garamond" w:cs="Times New Roman"/>
+              </w:rPr>
+            </w:rPrChange>
+          </w:rPr>
+          <w:delText xml:space="preserve"> </w:delText>
+        </w:r>
+        <w:r>
+          <w:rPr>
+            <w:rFonts w:ascii="Garamond" w:hAnsi="Garamond"/>
+            <w:highlight w:val="yellow"/>
+            <w:rPrChange w:id="43" w:author="Benjamin J. Makhlouf" w:date="2026-06-22T09:56:00Z" w16du:dateUtc="2026-06-22T16:56:00Z">
+              <w:rPr>
+                <w:rFonts w:ascii="Garamond" w:hAnsi="Garamond"/>
+              </w:rPr>
+            </w:rPrChange>
+          </w:rPr>
+          <w:delText xml:space="preserve">and sequential nature of large river salmon fisheries </w:delText>
+        </w:r>
+      </w:del>
+      <w:r>
+        <w:rPr>
+          <w:rFonts w:ascii="Garamond" w:hAnsi="Garamond" w:cs="Times New Roman"/>
+          <w:highlight w:val="yellow"/>
+          <w:rPrChange w:id="44" w:author="Benjamin J. Makhlouf" w:date="2026-06-22T09:56:00Z" w16du:dateUtc="2026-06-22T16:56:00Z">
+            <w:rPr>
+              <w:rFonts w:ascii="Garamond" w:hAnsi="Garamond" w:cs="Times New Roman"/>
+            </w:rPr>
+          </w:rPrChange>
         </w:rPr>
         <w:fldChar w:fldCharType="begin"/>
       </w:r>
       <w:r>
         <w:rPr>
           <w:rFonts w:ascii="Garamond" w:hAnsi="Garamond" w:cs="Times New Roman"/>
+          <w:highlight w:val="yellow"/>
+          <w:rPrChange w:id="45" w:author="Benjamin J. Makhlouf" w:date="2026-06-22T09:56:00Z" w16du:dateUtc="2026-06-22T16:56:00Z">
+            <w:rPr>
+              <w:rFonts w:ascii="Garamond" w:hAnsi="Garamond" w:cs="Times New Roman"/>
+            </w:rPr>
+          </w:rPrChange>
         </w:rPr>
         <w:instrText xml:space="preserve"> ADDIN ZOTERO_ITEM CSL_CITATION {"citationID":"48p09nPT","properties":{"formattedCitation":"(Hamazaki, 2008)","plainCitation":"(Hamazaki, 2008)","dontUpdate":true,"noteIndex":0},"citationItems":[{"id":6021,"uris":["http://zotero.org/users/8421274/items/G45XBM9M"],"itemData":{"id":6021,"type":"article-journal","abstract":"This study examined the effectiveness of subsistence fishery closure “windows” scheduling as a management tool for conservation of Chinook salmon (Oncorhynchus tshawytscha) in the Kuskokwim River, Alaska. The windows, which reduced subsistence fishing from seven days to four days a week, were implemented in 2001 to conserve early migrant/upperriver Chinook salmon stock and to provide subsistence harvest opportunities for upper</w:instrText>
       </w:r>
       <w:r>
         <w:rPr>
           <w:rFonts w:ascii="Cambria Math" w:hAnsi="Cambria Math" w:cs="Cambria Math"/>
+          <w:highlight w:val="yellow"/>
+          <w:rPrChange w:id="46" w:author="Benjamin J. Makhlouf" w:date="2026-06-22T09:56:00Z" w16du:dateUtc="2026-06-22T16:56:00Z">
+            <w:rPr>
+              <w:rFonts w:ascii="Cambria Math" w:hAnsi="Cambria Math" w:cs="Cambria Math"/>
+            </w:rPr>
+          </w:rPrChange>
         </w:rPr>
         <w:instrText>‐</w:instrText>
       </w:r>
       <w:r>
         <w:rPr>
           <w:rFonts w:ascii="Garamond" w:hAnsi="Garamond" w:cs="Times New Roman"/>
+          <w:highlight w:val="yellow"/>
+          <w:rPrChange w:id="47" w:author="Benjamin J. Makhlouf" w:date="2026-06-22T09:56:00Z" w16du:dateUtc="2026-06-22T16:56:00Z">
+            <w:rPr>
+              <w:rFonts w:ascii="Garamond" w:hAnsi="Garamond" w:cs="Times New Roman"/>
+            </w:rPr>
+          </w:rPrChange>
         </w:rPr>
         <w:instrText xml:space="preserve">river communities. The windows were expected to (1) reduce the proportion of Chinook salmon harvests in the early season, (2) delay the harvest timing, and (3) extend the total fishing days. To examine its effectiveness, subsistence salmon harvest calendars (1989–2006) were collected and examined for changes in harvest timing before and after the windows were implemented. The results showed that the windows did not reduce harvests early in the season, delay the harvest timing, or extend the total fishing days. This suggests that the windows were not effective. Potential reasons for this failure are discussed.","container-title":"Fisheries","DOI":"10.1577/1548-8446-33.10.495","ISSN":"0363-2415","issue":"10","page":"495-501","source":"Silverchair","title":"“When people argue about fish, the fish disappear.”","volume":"33","author":[{"family":"Hamazaki","given":"Toshihide"}],"issued":{"date-parts":[["2008",10,1]]}}}],"schema":"https://github.com/citation-style-language/schema/raw/master/csl-citation.json"} </w:instrText>
       </w:r>
       <w:r>
         <w:rPr>
           <w:rFonts w:ascii="Garamond" w:hAnsi="Garamond" w:cs="Times New Roman"/>
+          <w:highlight w:val="yellow"/>
+          <w:rPrChange w:id="48" w:author="Benjamin J. Makhlouf" w:date="2026-06-22T09:56:00Z" w16du:dateUtc="2026-06-22T16:56:00Z">
+            <w:rPr>
+              <w:rFonts w:ascii="Garamond" w:hAnsi="Garamond" w:cs="Times New Roman"/>
+            </w:rPr>
+          </w:rPrChange>
         </w:rPr>
         <w:fldChar w:fldCharType="separate"/>
       </w:r>
@@ -1216,12 +1350,25 @@
         <w:rPr>
           <w:rFonts w:ascii="Garamond" w:hAnsi="Garamond" w:cs="Times New Roman"/>
           <w:noProof/>
+          <w:highlight w:val="yellow"/>
+          <w:rPrChange w:id="49" w:author="Benjamin J. Makhlouf" w:date="2026-06-22T09:56:00Z" w16du:dateUtc="2026-06-22T16:56:00Z">
+            <w:rPr>
+              <w:rFonts w:ascii="Garamond" w:hAnsi="Garamond" w:cs="Times New Roman"/>
+              <w:noProof/>
+            </w:rPr>
+          </w:rPrChange>
         </w:rPr>
         <w:t>(e.g. Hamazaki, 2008)</w:t>
       </w:r>
       <w:r>
         <w:rPr>
           <w:rFonts w:ascii="Garamond" w:hAnsi="Garamond" w:cs="Times New Roman"/>
+          <w:highlight w:val="yellow"/>
+          <w:rPrChange w:id="50" w:author="Benjamin J. Makhlouf" w:date="2026-06-22T09:56:00Z" w16du:dateUtc="2026-06-22T16:56:00Z">
+            <w:rPr>
+              <w:rFonts w:ascii="Garamond" w:hAnsi="Garamond" w:cs="Times New Roman"/>
+            </w:rPr>
+          </w:rPrChange>
         </w:rPr>
         <w:fldChar w:fldCharType="end"/>
       </w:r>
@@ -1231,7 +1378,7 @@
         </w:rPr>
         <w:t xml:space="preserve">. </w:t>
       </w:r>
-      <w:ins w:id="31" w:author="Benjamin J. Makhlouf" w:date="2026-06-19T15:17:00Z">
+      <w:ins w:id="51" w:author="Benjamin J. Makhlouf" w:date="2026-06-19T15:17:00Z">
         <w:r>
           <w:rPr>
             <w:rFonts w:ascii="Garamond" w:hAnsi="Garamond" w:cs="Times New Roman"/>
@@ -1239,7 +1386,7 @@
           <w:t xml:space="preserve">However, the timing, yield, and duration of downstream fisheries are shaped by the combined dynamics of the multiple upstream </w:t>
         </w:r>
       </w:ins>
-      <w:ins w:id="32" w:author="Benjamin J. Makhlouf" w:date="2026-06-19T15:17:00Z" w16du:dateUtc="2026-06-19T22:17:00Z">
+      <w:ins w:id="52" w:author="Benjamin J. Makhlouf" w:date="2026-06-19T15:17:00Z" w16du:dateUtc="2026-06-19T22:17:00Z">
         <w:r>
           <w:rPr>
             <w:rFonts w:ascii="Garamond" w:hAnsi="Garamond" w:cs="Times New Roman"/>
@@ -1247,7 +1394,7 @@
           <w:t>sub-</w:t>
         </w:r>
       </w:ins>
-      <w:ins w:id="33" w:author="Benjamin J. Makhlouf" w:date="2026-06-19T15:17:00Z">
+      <w:ins w:id="53" w:author="Benjamin J. Makhlouf" w:date="2026-06-19T15:17:00Z">
         <w:r>
           <w:rPr>
             <w:rFonts w:ascii="Garamond" w:hAnsi="Garamond" w:cs="Times New Roman"/>
@@ -1255,7 +1402,7 @@
           <w:t>populations that contribute fish to those fisheries</w:t>
         </w:r>
       </w:ins>
-      <w:ins w:id="34" w:author="Benjamin J. Makhlouf" w:date="2026-06-19T15:17:00Z" w16du:dateUtc="2026-06-19T22:17:00Z">
+      <w:ins w:id="54" w:author="Benjamin J. Makhlouf" w:date="2026-06-19T15:17:00Z" w16du:dateUtc="2026-06-19T22:17:00Z">
         <w:r>
           <w:rPr>
             <w:rFonts w:ascii="Garamond" w:hAnsi="Garamond" w:cs="Times New Roman"/>
@@ -1263,7 +1410,7 @@
           <w:t xml:space="preserve">. </w:t>
         </w:r>
       </w:ins>
-      <w:del w:id="35" w:author="Benjamin J. Makhlouf" w:date="2026-06-19T15:17:00Z" w16du:dateUtc="2026-06-19T22:17:00Z">
+      <w:del w:id="55" w:author="Benjamin J. Makhlouf" w:date="2026-06-19T15:17:00Z" w16du:dateUtc="2026-06-19T22:17:00Z">
         <w:r>
           <w:rPr>
             <w:rFonts w:ascii="Garamond" w:hAnsi="Garamond" w:cs="Times New Roman"/>
@@ -1308,7 +1455,7 @@
         </w:rPr>
         <w:t>.</w:t>
       </w:r>
-      <w:ins w:id="36" w:author="Benjamin J. Makhlouf" w:date="2026-06-19T15:15:00Z" w16du:dateUtc="2026-06-19T22:15:00Z">
+      <w:ins w:id="56" w:author="Benjamin J. Makhlouf" w:date="2026-06-19T15:15:00Z" w16du:dateUtc="2026-06-19T22:15:00Z">
         <w:r>
           <w:rPr>
             <w:rFonts w:ascii="Garamond" w:hAnsi="Garamond" w:cs="Times New Roman"/>
@@ -1316,7 +1463,7 @@
           <w:t xml:space="preserve"> </w:t>
         </w:r>
       </w:ins>
-      <w:ins w:id="37" w:author="Benjamin J. Makhlouf" w:date="2026-06-19T15:18:00Z">
+      <w:ins w:id="57" w:author="Benjamin J. Makhlouf" w:date="2026-06-19T15:18:00Z">
         <w:r>
           <w:rPr>
             <w:rFonts w:ascii="Garamond" w:hAnsi="Garamond" w:cs="Times New Roman"/>
@@ -1324,7 +1471,7 @@
           <w:t xml:space="preserve">For example, diversity in return timing among upstream populations may extend the duration of downstream fishing opportunities relative to a more homogenized stock complex in which fish return </w:t>
         </w:r>
       </w:ins>
-      <w:ins w:id="38" w:author="Benjamin J. Makhlouf" w:date="2026-06-19T15:18:00Z" w16du:dateUtc="2026-06-19T22:18:00Z">
+      <w:ins w:id="58" w:author="Benjamin J. Makhlouf" w:date="2026-06-19T15:18:00Z" w16du:dateUtc="2026-06-19T22:18:00Z">
         <w:r>
           <w:rPr>
             <w:rFonts w:ascii="Garamond" w:hAnsi="Garamond" w:cs="Times New Roman"/>
@@ -1338,7 +1485,7 @@
           <w:t xml:space="preserve"> </w:t>
         </w:r>
       </w:ins>
-      <w:ins w:id="39" w:author="Benjamin J. Makhlouf" w:date="2026-06-19T15:21:00Z">
+      <w:ins w:id="59" w:author="Benjamin J. Makhlouf" w:date="2026-06-19T15:21:00Z">
         <w:r>
           <w:rPr>
             <w:rFonts w:ascii="Garamond" w:hAnsi="Garamond" w:cs="Times New Roman"/>
@@ -1346,7 +1493,7 @@
           <w:t>Further, maintaining life-history diversity across the full stock complex enhances ecosystem resilience by spreading risk across space and time. This</w:t>
         </w:r>
       </w:ins>
-      <w:ins w:id="40" w:author="Benjamin J. Makhlouf" w:date="2026-06-19T15:21:00Z" w16du:dateUtc="2026-06-19T22:21:00Z">
+      <w:ins w:id="60" w:author="Benjamin J. Makhlouf" w:date="2026-06-19T15:21:00Z" w16du:dateUtc="2026-06-19T22:21:00Z">
         <w:r>
           <w:rPr>
             <w:rFonts w:ascii="Garamond" w:hAnsi="Garamond" w:cs="Times New Roman"/>
@@ -1354,7 +1501,7 @@
           <w:t>, in turn,</w:t>
         </w:r>
       </w:ins>
-      <w:ins w:id="41" w:author="Benjamin J. Makhlouf" w:date="2026-06-19T15:21:00Z">
+      <w:ins w:id="61" w:author="Benjamin J. Makhlouf" w:date="2026-06-19T15:21:00Z">
         <w:r>
           <w:rPr>
             <w:rFonts w:ascii="Garamond" w:hAnsi="Garamond" w:cs="Times New Roman"/>
@@ -1362,7 +1509,7 @@
           <w:t xml:space="preserve"> result</w:t>
         </w:r>
       </w:ins>
-      <w:ins w:id="42" w:author="Benjamin J. Makhlouf" w:date="2026-06-19T15:21:00Z" w16du:dateUtc="2026-06-19T22:21:00Z">
+      <w:ins w:id="62" w:author="Benjamin J. Makhlouf" w:date="2026-06-19T15:21:00Z" w16du:dateUtc="2026-06-19T22:21:00Z">
         <w:r>
           <w:rPr>
             <w:rFonts w:ascii="Garamond" w:hAnsi="Garamond" w:cs="Times New Roman"/>
@@ -1370,7 +1517,7 @@
           <w:t>s</w:t>
         </w:r>
       </w:ins>
-      <w:ins w:id="43" w:author="Benjamin J. Makhlouf" w:date="2026-06-19T15:21:00Z">
+      <w:ins w:id="63" w:author="Benjamin J. Makhlouf" w:date="2026-06-19T15:21:00Z">
         <w:r>
           <w:rPr>
             <w:rFonts w:ascii="Garamond" w:hAnsi="Garamond" w:cs="Times New Roman"/>
@@ -1378,7 +1525,7 @@
           <w:t xml:space="preserve"> in more reliable delivery of ecosystem services by reducing interannual variability in the abundance of returning fish at the watershed scale</w:t>
         </w:r>
       </w:ins>
-      <w:ins w:id="44" w:author="Benjamin J. Makhlouf" w:date="2026-06-19T15:21:00Z" w16du:dateUtc="2026-06-19T22:21:00Z">
+      <w:ins w:id="64" w:author="Benjamin J. Makhlouf" w:date="2026-06-19T15:21:00Z" w16du:dateUtc="2026-06-19T22:21:00Z">
         <w:r>
           <w:rPr>
             <w:rFonts w:ascii="Garamond" w:hAnsi="Garamond" w:cs="Times New Roman"/>
@@ -1423,7 +1570,7 @@
         </w:rPr>
         <w:t>. Designing strategies which explicitly consider and protect this biodiversity, including vulnerable upstream populations, therefore contributes to stabilizing downstream fishery resources</w:t>
       </w:r>
-      <w:ins w:id="45" w:author="Benjamin J. Makhlouf" w:date="2026-06-19T15:31:00Z" w16du:dateUtc="2026-06-19T22:31:00Z">
+      <w:ins w:id="65" w:author="Benjamin J. Makhlouf" w:date="2026-06-19T15:31:00Z" w16du:dateUtc="2026-06-19T22:31:00Z">
         <w:r>
           <w:rPr>
             <w:rFonts w:ascii="Garamond" w:hAnsi="Garamond" w:cs="Times New Roman"/>
@@ -1446,7 +1593,7 @@
           <w:rFonts w:ascii="Garamond" w:hAnsi="Garamond" w:cs="Times New Roman"/>
         </w:rPr>
       </w:pPr>
-      <w:ins w:id="46" w:author="Benjamin J. Makhlouf" w:date="2026-06-18T14:25:00Z" w16du:dateUtc="2026-06-18T21:25:00Z">
+      <w:ins w:id="66" w:author="Benjamin J. Makhlouf" w:date="2026-06-18T14:25:00Z" w16du:dateUtc="2026-06-18T21:25:00Z">
         <w:r>
           <w:rPr>
             <w:rFonts w:ascii="Garamond" w:hAnsi="Garamond" w:cs="Times New Roman"/>
@@ -1454,7 +1601,7 @@
           <w:t>W</w:t>
         </w:r>
       </w:ins>
-      <w:del w:id="47" w:author="Benjamin J. Makhlouf" w:date="2026-06-18T14:25:00Z" w16du:dateUtc="2026-06-18T21:25:00Z">
+      <w:del w:id="67" w:author="Benjamin J. Makhlouf" w:date="2026-06-18T14:25:00Z" w16du:dateUtc="2026-06-18T21:25:00Z">
         <w:r>
           <w:rPr>
             <w:rFonts w:ascii="Garamond" w:hAnsi="Garamond" w:cs="Times New Roman"/>
@@ -1500,7 +1647,14 @@
         <w:rPr>
           <w:rFonts w:ascii="Garamond" w:hAnsi="Garamond" w:cs="Times New Roman"/>
         </w:rPr>
-        <w:t xml:space="preserve">However, several species of Pacific salmon, including Chinook salmon, have declined precipitously in recent years throughout western Alaska watersheds </w:t>
+        <w:t xml:space="preserve">However, several species of Pacific salmon, including </w:t>
+      </w:r>
+      <w:r>
+        <w:rPr>
+          <w:rFonts w:ascii="Garamond" w:hAnsi="Garamond" w:cs="Times New Roman"/>
+        </w:rPr>
+        <w:lastRenderedPageBreak/>
+        <w:t xml:space="preserve">Chinook salmon, have declined precipitously in recent years throughout western Alaska watersheds </w:t>
       </w:r>
       <w:r>
         <w:rPr>
@@ -1587,14 +1741,7 @@
         <w:rPr>
           <w:rFonts w:ascii="Garamond" w:hAnsi="Garamond" w:cs="Times New Roman"/>
         </w:rPr>
-        <w:t xml:space="preserve">) free-flowing </w:t>
-      </w:r>
-      <w:r>
-        <w:rPr>
-          <w:rFonts w:ascii="Garamond" w:hAnsi="Garamond" w:cs="Times New Roman"/>
-        </w:rPr>
-        <w:lastRenderedPageBreak/>
-        <w:t xml:space="preserve">watershed in western Alaska, Chinook salmon populations support subsistence fishing opportunities for dozens of rural communities, comprised by a majority of Alaska Natives </w:t>
+        <w:t xml:space="preserve">) free-flowing watershed in western Alaska, Chinook salmon populations support subsistence fishing opportunities for dozens of rural communities, comprised by a majority of Alaska Natives </w:t>
       </w:r>
       <w:r>
         <w:rPr>
@@ -1633,14 +1780,14 @@
         </w:rPr>
         <w:t xml:space="preserve">. </w:t>
       </w:r>
-      <w:commentRangeStart w:id="48"/>
+      <w:commentRangeStart w:id="68"/>
       <w:r>
         <w:rPr>
           <w:rFonts w:ascii="Garamond" w:hAnsi="Garamond" w:cs="Times New Roman"/>
         </w:rPr>
         <w:t>Subsistence</w:t>
       </w:r>
-      <w:commentRangeEnd w:id="48"/>
+      <w:commentRangeEnd w:id="68"/>
       <w:r>
         <w:rPr>
           <w:rStyle w:val="CommentReference"/>
@@ -1648,7 +1795,7 @@
           <w:sz w:val="24"/>
           <w:szCs w:val="24"/>
         </w:rPr>
-        <w:commentReference w:id="48"/>
+        <w:commentReference w:id="68"/>
       </w:r>
       <w:r>
         <w:rPr>
@@ -1755,7 +1902,7 @@
         </w:rPr>
         <w:t xml:space="preserve">This strategy is designed to protect early migrating fish which are assumed to be returning to spawn in the furthest upstream regions of the Kuskokwim River. </w:t>
       </w:r>
-      <w:ins w:id="49" w:author="Benjamin J. Makhlouf" w:date="2026-06-19T15:33:00Z" w16du:dateUtc="2026-06-19T22:33:00Z">
+      <w:ins w:id="69" w:author="Benjamin J. Makhlouf" w:date="2026-06-19T15:33:00Z" w16du:dateUtc="2026-06-19T22:33:00Z">
         <w:r>
           <w:rPr>
             <w:rFonts w:ascii="Garamond" w:hAnsi="Garamond" w:cs="Times New Roman"/>
@@ -1763,7 +1910,7 @@
           <w:t>In doing so</w:t>
         </w:r>
       </w:ins>
-      <w:ins w:id="50" w:author="Benjamin J. Makhlouf" w:date="2026-06-19T15:34:00Z" w16du:dateUtc="2026-06-19T22:34:00Z">
+      <w:ins w:id="70" w:author="Benjamin J. Makhlouf" w:date="2026-06-19T15:34:00Z" w16du:dateUtc="2026-06-19T22:34:00Z">
         <w:r>
           <w:rPr>
             <w:rFonts w:ascii="Garamond" w:hAnsi="Garamond" w:cs="Times New Roman"/>
@@ -1771,9 +1918,9 @@
           <w:t xml:space="preserve">, managers aim to </w:t>
         </w:r>
       </w:ins>
-      <w:moveToRangeStart w:id="51" w:author="Benjamin J. Makhlouf" w:date="2026-06-19T15:33:00Z" w:name="move232775618"/>
-      <w:moveTo w:id="52" w:author="Benjamin J. Makhlouf" w:date="2026-06-19T15:33:00Z" w16du:dateUtc="2026-06-19T22:33:00Z">
-        <w:del w:id="53" w:author="Benjamin J. Makhlouf" w:date="2026-06-19T15:34:00Z" w16du:dateUtc="2026-06-19T22:34:00Z">
+      <w:moveToRangeStart w:id="71" w:author="Benjamin J. Makhlouf" w:date="2026-06-19T15:33:00Z" w:name="move232775618"/>
+      <w:moveTo w:id="72" w:author="Benjamin J. Makhlouf" w:date="2026-06-19T15:33:00Z" w16du:dateUtc="2026-06-19T22:33:00Z">
+        <w:del w:id="73" w:author="Benjamin J. Makhlouf" w:date="2026-06-19T15:34:00Z" w16du:dateUtc="2026-06-19T22:34:00Z">
           <w:r>
             <w:rPr>
               <w:rFonts w:ascii="Garamond" w:hAnsi="Garamond" w:cs="Times New Roman"/>
@@ -1788,8 +1935,8 @@
           <w:t>support basin-wide escapement goals, provide more equitable harvest opportunities to upstream communities, and protect upper river stocks which are at heightened risk of overharvest but contribute disproportionately to stabilizing downstream fishery dynamics.</w:t>
         </w:r>
       </w:moveTo>
-      <w:moveToRangeEnd w:id="51"/>
-      <w:ins w:id="54" w:author="Benjamin J. Makhlouf" w:date="2026-06-19T15:35:00Z" w16du:dateUtc="2026-06-19T22:35:00Z">
+      <w:moveToRangeEnd w:id="71"/>
+      <w:ins w:id="74" w:author="Benjamin J. Makhlouf" w:date="2026-06-19T15:35:00Z" w16du:dateUtc="2026-06-19T22:35:00Z">
         <w:r>
           <w:rPr>
             <w:rFonts w:ascii="Garamond" w:hAnsi="Garamond" w:cs="Times New Roman"/>
@@ -1797,7 +1944,7 @@
           <w:t xml:space="preserve"> The relationship between return timing and watershed position underpinning this strategy  </w:t>
         </w:r>
       </w:ins>
-      <w:del w:id="55" w:author="Benjamin J. Makhlouf" w:date="2026-06-19T15:35:00Z" w16du:dateUtc="2026-06-19T22:35:00Z">
+      <w:del w:id="75" w:author="Benjamin J. Makhlouf" w:date="2026-06-19T15:35:00Z" w16du:dateUtc="2026-06-19T22:35:00Z">
         <w:r>
           <w:rPr>
             <w:rFonts w:ascii="Garamond" w:hAnsi="Garamond" w:cs="Times New Roman"/>
@@ -1811,7 +1958,7 @@
         </w:rPr>
         <w:t xml:space="preserve">is </w:t>
       </w:r>
-      <w:ins w:id="56" w:author="Benjamin J. Makhlouf" w:date="2026-06-19T15:35:00Z" w16du:dateUtc="2026-06-19T22:35:00Z">
+      <w:ins w:id="76" w:author="Benjamin J. Makhlouf" w:date="2026-06-19T15:35:00Z" w16du:dateUtc="2026-06-19T22:35:00Z">
         <w:r>
           <w:rPr>
             <w:rFonts w:ascii="Garamond" w:hAnsi="Garamond" w:cs="Times New Roman"/>
@@ -1819,7 +1966,7 @@
           <w:t xml:space="preserve">based on </w:t>
         </w:r>
       </w:ins>
-      <w:del w:id="57" w:author="Benjamin J. Makhlouf" w:date="2026-06-19T15:35:00Z" w16du:dateUtc="2026-06-19T22:35:00Z">
+      <w:del w:id="77" w:author="Benjamin J. Makhlouf" w:date="2026-06-19T15:35:00Z" w16du:dateUtc="2026-06-19T22:35:00Z">
         <w:r>
           <w:rPr>
             <w:rFonts w:ascii="Garamond" w:hAnsi="Garamond" w:cs="Times New Roman"/>
@@ -1906,7 +2053,7 @@
         </w:rPr>
         <w:t xml:space="preserve">, </w:t>
       </w:r>
-      <w:del w:id="58" w:author="Benjamin J. Makhlouf" w:date="2026-06-19T15:36:00Z" w16du:dateUtc="2026-06-19T22:36:00Z">
+      <w:del w:id="78" w:author="Benjamin J. Makhlouf" w:date="2026-06-19T15:36:00Z" w16du:dateUtc="2026-06-19T22:36:00Z">
         <w:r>
           <w:rPr>
             <w:rFonts w:ascii="Garamond" w:hAnsi="Garamond" w:cs="Times New Roman"/>
@@ -1957,17 +2104,24 @@
         </w:rPr>
         <w:t xml:space="preserve">, and further motivated by traditional and local knowledge held by Tribal citizens and stakeholders. </w:t>
       </w:r>
-      <w:moveFromRangeStart w:id="59" w:author="Benjamin J. Makhlouf" w:date="2026-06-19T15:33:00Z" w:name="move232775618"/>
-      <w:moveFrom w:id="60" w:author="Benjamin J. Makhlouf" w:date="2026-06-19T15:33:00Z" w16du:dateUtc="2026-06-19T22:33:00Z">
+      <w:moveFromRangeStart w:id="79" w:author="Benjamin J. Makhlouf" w:date="2026-06-19T15:33:00Z" w:name="move232775618"/>
+      <w:moveFrom w:id="80" w:author="Benjamin J. Makhlouf" w:date="2026-06-19T15:33:00Z" w16du:dateUtc="2026-06-19T22:33:00Z">
         <w:r>
           <w:rPr>
             <w:rFonts w:ascii="Garamond" w:hAnsi="Garamond" w:cs="Times New Roman"/>
           </w:rPr>
-          <w:t xml:space="preserve">By protecting upriver stocks, managers aim to support basin-wide escapement goals, provide more equitable harvest opportunities to upstream communities, and protect upper river stocks which are at heightened risk of overharvest but contribute disproportionately to stabilizing downstream fishery dynamics. </w:t>
+          <w:t xml:space="preserve">By protecting upriver stocks, managers aim to support basin-wide </w:t>
+        </w:r>
+        <w:r>
+          <w:rPr>
+            <w:rFonts w:ascii="Garamond" w:hAnsi="Garamond" w:cs="Times New Roman"/>
+          </w:rPr>
+          <w:lastRenderedPageBreak/>
+          <w:t xml:space="preserve">escapement goals, provide more equitable harvest opportunities to upstream communities, and protect upper river stocks which are at heightened risk of overharvest but contribute disproportionately to stabilizing downstream fishery dynamics. </w:t>
         </w:r>
       </w:moveFrom>
-      <w:moveFromRangeEnd w:id="59"/>
-      <w:ins w:id="61" w:author="Benjamin J. Makhlouf" w:date="2026-06-19T15:36:00Z" w16du:dateUtc="2026-06-19T22:36:00Z">
+      <w:moveFromRangeEnd w:id="79"/>
+      <w:ins w:id="81" w:author="Benjamin J. Makhlouf" w:date="2026-06-19T15:36:00Z" w16du:dateUtc="2026-06-19T22:36:00Z">
         <w:r>
           <w:rPr>
             <w:rFonts w:ascii="Garamond" w:hAnsi="Garamond" w:cs="Times New Roman"/>
@@ -1975,7 +2129,7 @@
           <w:t xml:space="preserve">However, </w:t>
         </w:r>
       </w:ins>
-      <w:ins w:id="62" w:author="Benjamin J. Makhlouf" w:date="2026-06-18T18:33:00Z">
+      <w:ins w:id="82" w:author="Benjamin J. Makhlouf" w:date="2026-06-18T18:33:00Z">
         <w:r>
           <w:rPr>
             <w:rFonts w:ascii="Garamond" w:hAnsi="Garamond" w:cs="Times New Roman"/>
@@ -1983,142 +2137,135 @@
           <w:t>the spatial ecology of Chinook salmon in the Kuskokwim River basin remains poorly understood at the watershed scale</w:t>
         </w:r>
       </w:ins>
-      <w:ins w:id="63" w:author="Benjamin J. Makhlouf" w:date="2026-06-19T15:36:00Z" w16du:dateUtc="2026-06-19T22:36:00Z">
+      <w:ins w:id="83" w:author="Benjamin J. Makhlouf" w:date="2026-06-19T15:36:00Z" w16du:dateUtc="2026-06-19T22:36:00Z">
         <w:r>
           <w:rPr>
             <w:rFonts w:ascii="Garamond" w:hAnsi="Garamond" w:cs="Times New Roman"/>
           </w:rPr>
-          <w:t xml:space="preserve">. </w:t>
-        </w:r>
+          <w:t>. As a result,</w:t>
+        </w:r>
+      </w:ins>
+      <w:ins w:id="84" w:author="Benjamin J. Makhlouf" w:date="2026-06-18T18:33:00Z">
         <w:r>
           <w:rPr>
             <w:rFonts w:ascii="Garamond" w:hAnsi="Garamond" w:cs="Times New Roman"/>
           </w:rPr>
-          <w:lastRenderedPageBreak/>
-          <w:t>As a result,</w:t>
+          <w:t xml:space="preserve"> it remains unclear whether the front-end fishery closure effectively protects upstream stocks as intended. </w:t>
         </w:r>
       </w:ins>
-      <w:ins w:id="64" w:author="Benjamin J. Makhlouf" w:date="2026-06-18T18:33:00Z">
+      <w:ins w:id="85" w:author="Benjamin J. Makhlouf" w:date="2026-06-18T18:35:00Z">
         <w:r>
           <w:rPr>
             <w:rFonts w:ascii="Garamond" w:hAnsi="Garamond" w:cs="Times New Roman"/>
           </w:rPr>
-          <w:t xml:space="preserve"> it remains unclear whether the front-end fishery closure effectively protects upstream stocks as intended. </w:t>
+          <w:t>Genetic approaches, which have been widely used to investigate population structure and provenance in other Pacific salmon species, cannot be used to estimate provenance in the Kuskokwim because Chinook salmon exhibit low genetic differentiation across the basin, while ongoing telemetry studies are logistically constrained in their ability to characterize migration dynamics across such a large and remote watershed.</w:t>
         </w:r>
       </w:ins>
-      <w:ins w:id="65" w:author="Benjamin J. Makhlouf" w:date="2026-06-18T18:35:00Z">
+      <w:ins w:id="86" w:author="Benjamin J. Makhlouf" w:date="2026-06-18T18:35:00Z" w16du:dateUtc="2026-06-19T01:35:00Z">
         <w:r>
           <w:rPr>
             <w:rFonts w:ascii="Garamond" w:hAnsi="Garamond" w:cs="Times New Roman"/>
           </w:rPr>
-          <w:t>Genetic approaches, which have been widely used to investigate population structure and provenance in other Pacific salmon species, cannot be used to estimate provenance in the Kuskokwim because Chinook salmon exhibit low genetic differentiation across the basin, while ongoing telemetry studies are logistically constrained in their ability to characterize migration dynamics across such a large and remote watershed.</w:t>
+          <w:t xml:space="preserve"> </w:t>
         </w:r>
       </w:ins>
-      <w:ins w:id="66" w:author="Benjamin J. Makhlouf" w:date="2026-06-18T18:35:00Z" w16du:dateUtc="2026-06-19T01:35:00Z">
+      <w:ins w:id="87" w:author="Benjamin J. Makhlouf" w:date="2026-06-18T18:37:00Z">
         <w:r>
           <w:rPr>
             <w:rFonts w:ascii="Garamond" w:hAnsi="Garamond" w:cs="Times New Roman"/>
           </w:rPr>
+          <w:t xml:space="preserve">Otolith microchemical approaches have emerged as an alternative tool capable of estimating sub-watershed provenance without the need for extensive field-based monitoring. </w:t>
+        </w:r>
+      </w:ins>
+      <w:ins w:id="88" w:author="Benjamin J. Makhlouf" w:date="2026-06-18T18:42:00Z">
+        <w:r>
+          <w:rPr>
+            <w:rFonts w:ascii="Garamond" w:hAnsi="Garamond"/>
+          </w:rPr>
+          <w:t>Otolith microchemical approaches have emerged as an alternative tool for reconstructing spatial patterns of salmon movement and provenance.</w:t>
+        </w:r>
+      </w:ins>
+      <w:ins w:id="89" w:author="Benjamin J. Makhlouf" w:date="2026-06-18T18:42:00Z" w16du:dateUtc="2026-06-19T01:42:00Z">
+        <w:r>
+          <w:rPr>
+            <w:rFonts w:ascii="Garamond" w:hAnsi="Garamond"/>
+          </w:rPr>
           <w:t xml:space="preserve"> </w:t>
         </w:r>
       </w:ins>
-      <w:ins w:id="67" w:author="Benjamin J. Makhlouf" w:date="2026-06-18T18:37:00Z">
-        <w:r>
-          <w:rPr>
-            <w:rFonts w:ascii="Garamond" w:hAnsi="Garamond" w:cs="Times New Roman"/>
-          </w:rPr>
-          <w:t xml:space="preserve">Otolith microchemical approaches have emerged as an alternative tool capable of estimating sub-watershed provenance without the need for extensive field-based monitoring. </w:t>
+      <w:ins w:id="90" w:author="Benjamin J. Makhlouf" w:date="2026-06-18T18:39:00Z">
+        <w:r>
+          <w:rPr>
+            <w:rFonts w:ascii="Garamond" w:hAnsi="Garamond"/>
+          </w:rPr>
+          <w:t>By leveraging predictable relationships between chemical signatures recorded in</w:t>
         </w:r>
       </w:ins>
-      <w:ins w:id="68" w:author="Benjamin J. Makhlouf" w:date="2026-06-18T18:42:00Z">
+      <w:ins w:id="91" w:author="Benjamin J. Makhlouf" w:date="2026-06-18T18:43:00Z" w16du:dateUtc="2026-06-19T01:43:00Z">
         <w:r>
           <w:rPr>
             <w:rFonts w:ascii="Garamond" w:hAnsi="Garamond"/>
           </w:rPr>
-          <w:t>Otolith microchemical approaches have emerged as an alternative tool for reconstructing spatial patterns of salmon movement and provenance.</w:t>
+          <w:t xml:space="preserve"> the</w:t>
         </w:r>
       </w:ins>
-      <w:ins w:id="69" w:author="Benjamin J. Makhlouf" w:date="2026-06-18T18:42:00Z" w16du:dateUtc="2026-06-19T01:42:00Z">
+      <w:ins w:id="92" w:author="Benjamin J. Makhlouf" w:date="2026-06-18T18:39:00Z">
         <w:r>
           <w:rPr>
             <w:rFonts w:ascii="Garamond" w:hAnsi="Garamond"/>
           </w:rPr>
-          <w:t xml:space="preserve"> </w:t>
+          <w:t xml:space="preserve"> otolith and those measured or modeled across the landscape, </w:t>
         </w:r>
       </w:ins>
-      <w:ins w:id="70" w:author="Benjamin J. Makhlouf" w:date="2026-06-18T18:39:00Z">
+      <w:ins w:id="93" w:author="Benjamin J. Makhlouf" w:date="2026-06-18T18:43:00Z" w16du:dateUtc="2026-06-19T01:43:00Z">
         <w:r>
           <w:rPr>
             <w:rFonts w:ascii="Garamond" w:hAnsi="Garamond"/>
           </w:rPr>
-          <w:t>By leveraging predictable relationships between chemical signatures recorded in</w:t>
+          <w:t>otolith-based</w:t>
         </w:r>
       </w:ins>
-      <w:ins w:id="71" w:author="Benjamin J. Makhlouf" w:date="2026-06-18T18:43:00Z" w16du:dateUtc="2026-06-19T01:43:00Z">
+      <w:ins w:id="94" w:author="Benjamin J. Makhlouf" w:date="2026-06-18T18:39:00Z">
         <w:r>
           <w:rPr>
             <w:rFonts w:ascii="Garamond" w:hAnsi="Garamond"/>
           </w:rPr>
-          <w:t xml:space="preserve"> the</w:t>
+          <w:t xml:space="preserve"> approaches enable </w:t>
         </w:r>
       </w:ins>
-      <w:ins w:id="72" w:author="Benjamin J. Makhlouf" w:date="2026-06-18T18:39:00Z">
+      <w:ins w:id="95" w:author="Benjamin J. Makhlouf" w:date="2026-06-18T18:43:00Z" w16du:dateUtc="2026-06-19T01:43:00Z">
         <w:r>
           <w:rPr>
             <w:rFonts w:ascii="Garamond" w:hAnsi="Garamond"/>
           </w:rPr>
-          <w:t xml:space="preserve"> otolith and those measured or modeled across the landscape, </w:t>
+          <w:t xml:space="preserve">the </w:t>
         </w:r>
       </w:ins>
-      <w:ins w:id="73" w:author="Benjamin J. Makhlouf" w:date="2026-06-18T18:43:00Z" w16du:dateUtc="2026-06-19T01:43:00Z">
+      <w:ins w:id="96" w:author="Benjamin J. Makhlouf" w:date="2026-06-18T18:39:00Z">
         <w:r>
           <w:rPr>
             <w:rFonts w:ascii="Garamond" w:hAnsi="Garamond"/>
           </w:rPr>
-          <w:t>otolith-based</w:t>
+          <w:t xml:space="preserve">reconstruction of </w:t>
         </w:r>
       </w:ins>
-      <w:ins w:id="74" w:author="Benjamin J. Makhlouf" w:date="2026-06-18T18:39:00Z">
+      <w:ins w:id="97" w:author="Benjamin J. Makhlouf" w:date="2026-06-18T18:44:00Z" w16du:dateUtc="2026-06-19T01:44:00Z">
         <w:r>
           <w:rPr>
             <w:rFonts w:ascii="Garamond" w:hAnsi="Garamond"/>
           </w:rPr>
-          <w:t xml:space="preserve"> approaches enable </w:t>
+          <w:t xml:space="preserve">life history characteristics </w:t>
         </w:r>
       </w:ins>
-      <w:ins w:id="75" w:author="Benjamin J. Makhlouf" w:date="2026-06-18T18:43:00Z" w16du:dateUtc="2026-06-19T01:43:00Z">
+      <w:ins w:id="98" w:author="Benjamin J. Makhlouf" w:date="2026-06-18T18:45:00Z" w16du:dateUtc="2026-06-19T01:45:00Z">
         <w:r>
           <w:rPr>
             <w:rFonts w:ascii="Garamond" w:hAnsi="Garamond"/>
           </w:rPr>
-          <w:t xml:space="preserve">the </w:t>
+          <w:t xml:space="preserve">throughout the lifetime of the individual inferred from samples easily collected from adult fish. </w:t>
         </w:r>
       </w:ins>
-      <w:ins w:id="76" w:author="Benjamin J. Makhlouf" w:date="2026-06-18T18:39:00Z">
-        <w:r>
-          <w:rPr>
-            <w:rFonts w:ascii="Garamond" w:hAnsi="Garamond"/>
-          </w:rPr>
-          <w:t xml:space="preserve">reconstruction of </w:t>
-        </w:r>
-      </w:ins>
-      <w:ins w:id="77" w:author="Benjamin J. Makhlouf" w:date="2026-06-18T18:44:00Z" w16du:dateUtc="2026-06-19T01:44:00Z">
-        <w:r>
-          <w:rPr>
-            <w:rFonts w:ascii="Garamond" w:hAnsi="Garamond"/>
-          </w:rPr>
-          <w:t xml:space="preserve">life history characteristics </w:t>
-        </w:r>
-      </w:ins>
-      <w:ins w:id="78" w:author="Benjamin J. Makhlouf" w:date="2026-06-18T18:45:00Z" w16du:dateUtc="2026-06-19T01:45:00Z">
-        <w:r>
-          <w:rPr>
-            <w:rFonts w:ascii="Garamond" w:hAnsi="Garamond"/>
-          </w:rPr>
-          <w:t xml:space="preserve">throughout the lifetime of the individual inferred from samples easily collected from adult fish. </w:t>
-        </w:r>
-      </w:ins>
-      <w:ins w:id="79" w:author="Benjamin J. Makhlouf" w:date="2026-06-18T18:48:00Z">
+      <w:ins w:id="99" w:author="Benjamin J. Makhlouf" w:date="2026-06-18T18:48:00Z">
         <w:r>
           <w:rPr>
             <w:rFonts w:ascii="Garamond" w:hAnsi="Garamond"/>
@@ -2143,7 +2290,7 @@
         </w:rPr>
         <w:t xml:space="preserve">Here, we use otolith chemistry from fish caught during a test fishery throughout the seasonal migration period over six years in the Kuskokwim River to reconstruct spatiotemporal patterns of Chinook salmon returns. </w:t>
       </w:r>
-      <w:del w:id="80" w:author="Benjamin J. Makhlouf" w:date="2026-06-18T18:48:00Z" w16du:dateUtc="2026-06-19T01:48:00Z">
+      <w:del w:id="100" w:author="Benjamin J. Makhlouf" w:date="2026-06-18T18:48:00Z" w16du:dateUtc="2026-06-19T01:48:00Z">
         <w:r>
           <w:rPr>
             <w:rFonts w:ascii="Garamond" w:hAnsi="Garamond" w:cs="Times New Roman"/>
@@ -2155,7 +2302,14 @@
         <w:rPr>
           <w:rFonts w:ascii="Garamond" w:hAnsi="Garamond" w:cs="Times New Roman"/>
         </w:rPr>
-        <w:t>Otolith-based methods for estimating provenance therefore offer a novel approach to: (1) identify the spatiotemporal structure of returning populations in the Kuskokwim River basin, and (2) evaluate potential impacts of front-end closures on conserving population diversity within salmon stock complexes returning to large, remote, watersheds.</w:t>
+        <w:t xml:space="preserve">Otolith-based methods for estimating provenance therefore offer a novel approach to: (1) identify the spatiotemporal structure of returning populations in the Kuskokwim River basin, and </w:t>
+      </w:r>
+      <w:r>
+        <w:rPr>
+          <w:rFonts w:ascii="Garamond" w:hAnsi="Garamond" w:cs="Times New Roman"/>
+        </w:rPr>
+        <w:lastRenderedPageBreak/>
+        <w:t>(2) evaluate potential impacts of front-end closures on conserving population diversity within salmon stock complexes returning to large, remote, watersheds.</w:t>
       </w:r>
     </w:p>
     <w:p>
@@ -2197,7 +2351,6 @@
           <w:szCs w:val="28"/>
           <w:u w:val="single"/>
         </w:rPr>
-        <w:lastRenderedPageBreak/>
         <w:t xml:space="preserve">Materials and Methods: </w:t>
       </w:r>
     </w:p>
@@ -2255,7 +2408,7 @@
         </w:rPr>
         <w:t xml:space="preserve"> to inform management decisions for fisheries throughout the river. Fish </w:t>
       </w:r>
-      <w:ins w:id="81" w:author="Benjamin J. Makhlouf" w:date="2026-06-19T15:58:00Z" w16du:dateUtc="2026-06-19T22:58:00Z">
+      <w:ins w:id="101" w:author="Benjamin J. Makhlouf" w:date="2026-06-19T15:58:00Z" w16du:dateUtc="2026-06-19T22:58:00Z">
         <w:r>
           <w:rPr>
             <w:rFonts w:ascii="Garamond" w:hAnsi="Garamond" w:cs="Times New Roman"/>
@@ -2263,7 +2416,7 @@
           <w:t xml:space="preserve">are sampled throughout the full return migration window, and are assumed to </w:t>
         </w:r>
       </w:ins>
-      <w:ins w:id="82" w:author="Benjamin J. Makhlouf" w:date="2026-06-19T15:59:00Z" w16du:dateUtc="2026-06-19T22:59:00Z">
+      <w:ins w:id="102" w:author="Benjamin J. Makhlouf" w:date="2026-06-19T15:59:00Z" w16du:dateUtc="2026-06-19T22:59:00Z">
         <w:r>
           <w:rPr>
             <w:rFonts w:ascii="Garamond" w:hAnsi="Garamond" w:cs="Times New Roman"/>
@@ -2271,7 +2424,7 @@
           <w:t>be</w:t>
         </w:r>
       </w:ins>
-      <w:ins w:id="83" w:author="Benjamin J. Makhlouf" w:date="2026-06-19T15:58:00Z" w16du:dateUtc="2026-06-19T22:58:00Z">
+      <w:ins w:id="103" w:author="Benjamin J. Makhlouf" w:date="2026-06-19T15:58:00Z" w16du:dateUtc="2026-06-19T22:58:00Z">
         <w:r>
           <w:rPr>
             <w:rFonts w:ascii="Garamond" w:hAnsi="Garamond" w:cs="Times New Roman"/>
@@ -2279,7 +2432,7 @@
           <w:t xml:space="preserve"> a </w:t>
         </w:r>
       </w:ins>
-      <w:del w:id="84" w:author="Benjamin J. Makhlouf" w:date="2026-06-19T15:59:00Z" w16du:dateUtc="2026-06-19T22:59:00Z">
+      <w:del w:id="104" w:author="Benjamin J. Makhlouf" w:date="2026-06-19T15:59:00Z" w16du:dateUtc="2026-06-19T22:59:00Z">
         <w:r>
           <w:rPr>
             <w:rFonts w:ascii="Garamond" w:hAnsi="Garamond" w:cs="Times New Roman"/>
@@ -2342,7 +2495,7 @@
         </w:rPr>
         <w:t>. Although this sample set does not capture fish which spawn below Bethel, nearly all Chinook salmon returning to the Kuskokwim River spawn above this location. Contributing partners collected approximately 500 otoliths annually from 2017-2022, ensuring sampling efforts over the full course of the run. From these, approximately 250 otoliths</w:t>
       </w:r>
-      <w:ins w:id="85" w:author="Benjamin J. Makhlouf" w:date="2026-06-19T16:10:00Z" w16du:dateUtc="2026-06-19T23:10:00Z">
+      <w:ins w:id="105" w:author="Benjamin J. Makhlouf" w:date="2026-06-19T16:10:00Z" w16du:dateUtc="2026-06-19T23:10:00Z">
         <w:r>
           <w:rPr>
             <w:rFonts w:ascii="Garamond" w:eastAsia="Times New Roman" w:hAnsi="Garamond" w:cs="Times New Roman"/>
@@ -2434,7 +2587,16 @@
           <w:kern w:val="0"/>
           <w14:ligatures w14:val="none"/>
         </w:rPr>
-        <w:t xml:space="preserve">. Prepared samples were analyzed at the University of Utah Strontium Isotope Laboratory using laser ablation inductively coupled plasma mass spectrometry (LA-ICP-MS). Laser ablation was conducted along a transect from the otolith core to just beyond the onset of marine growth (identified by the dark annuli check indicative of marine entry) </w:t>
+        <w:t xml:space="preserve">. Prepared samples were analyzed at the University of Utah Strontium Isotope Laboratory using laser ablation inductively coupled plasma mass spectrometry (LA-ICP-MS). Laser ablation was conducted along a transect from the otolith </w:t>
+      </w:r>
+      <w:r>
+        <w:rPr>
+          <w:rFonts w:ascii="Garamond" w:eastAsia="Times New Roman" w:hAnsi="Garamond" w:cs="Times New Roman"/>
+          <w:kern w:val="0"/>
+          <w14:ligatures w14:val="none"/>
+        </w:rPr>
+        <w:lastRenderedPageBreak/>
+        <w:t xml:space="preserve">core to just beyond the onset of marine growth (identified by the dark annuli check indicative of marine entry) </w:t>
       </w:r>
       <w:r>
         <w:rPr>
@@ -2607,16 +2769,7 @@
           <w:kern w:val="0"/>
           <w14:ligatures w14:val="none"/>
         </w:rPr>
-        <w:t xml:space="preserve"> value </w:t>
-      </w:r>
-      <w:r>
-        <w:rPr>
-          <w:rFonts w:ascii="Garamond" w:eastAsia="Times New Roman" w:hAnsi="Garamond" w:cs="Times New Roman"/>
-          <w:kern w:val="0"/>
-          <w14:ligatures w14:val="none"/>
-        </w:rPr>
-        <w:lastRenderedPageBreak/>
-        <w:t>associated with the natal freshwater rearing period was extracted by examining patterns of change in Sr</w:t>
+        <w:t xml:space="preserve"> value associated with the natal freshwater rearing period was extracted by examining patterns of change in Sr</w:t>
       </w:r>
       <w:r>
         <w:rPr>
@@ -2669,7 +2822,7 @@
         </w:rPr>
         <w:t xml:space="preserve"> between the core and freshwater region, morphological features of the otolith visible along the ablation path, and known distances from the core</w:t>
       </w:r>
-      <w:ins w:id="86" w:author="Benjamin J. Makhlouf" w:date="2026-06-18T19:47:00Z" w16du:dateUtc="2026-06-19T02:47:00Z">
+      <w:ins w:id="106" w:author="Benjamin J. Makhlouf" w:date="2026-06-18T19:47:00Z" w16du:dateUtc="2026-06-19T02:47:00Z">
         <w:r>
           <w:rPr>
             <w:rFonts w:ascii="Garamond" w:eastAsia="Times New Roman" w:hAnsi="Garamond" w:cs="Times New Roman"/>
@@ -2684,7 +2837,7 @@
             <w:kern w:val="0"/>
             <w:highlight w:val="yellow"/>
             <w14:ligatures w14:val="none"/>
-            <w:rPrChange w:id="87" w:author="Benjamin J. Makhlouf" w:date="2026-06-18T19:47:00Z" w16du:dateUtc="2026-06-19T02:47:00Z">
+            <w:rPrChange w:id="107" w:author="Benjamin J. Makhlouf" w:date="2026-06-18T19:47:00Z" w16du:dateUtc="2026-06-19T02:47:00Z">
               <w:rPr>
                 <w:rFonts w:ascii="Garamond" w:eastAsia="Times New Roman" w:hAnsi="Garamond" w:cs="Times New Roman"/>
                 <w:kern w:val="0"/>
@@ -2752,7 +2905,7 @@
         </w:rPr>
         <w:t>.</w:t>
       </w:r>
-      <w:ins w:id="88" w:author="Benjamin J. Makhlouf" w:date="2026-06-18T19:45:00Z" w16du:dateUtc="2026-06-19T02:45:00Z">
+      <w:ins w:id="108" w:author="Benjamin J. Makhlouf" w:date="2026-06-18T19:45:00Z" w16du:dateUtc="2026-06-19T02:45:00Z">
         <w:r>
           <w:rPr>
             <w:rFonts w:ascii="Garamond" w:eastAsia="Times New Roman" w:hAnsi="Garamond" w:cs="Times New Roman"/>
@@ -2762,7 +2915,7 @@
           <w:t xml:space="preserve"> </w:t>
         </w:r>
       </w:ins>
-      <w:ins w:id="89" w:author="Benjamin J. Makhlouf" w:date="2026-06-18T19:47:00Z" w16du:dateUtc="2026-06-19T02:47:00Z">
+      <w:ins w:id="109" w:author="Benjamin J. Makhlouf" w:date="2026-06-18T19:47:00Z" w16du:dateUtc="2026-06-19T02:47:00Z">
         <w:r>
           <w:rPr>
             <w:rFonts w:ascii="Garamond" w:eastAsia="Times New Roman" w:hAnsi="Garamond" w:cs="Times New Roman"/>
@@ -2781,7 +2934,7 @@
           <w:t>88</w:t>
         </w:r>
       </w:ins>
-      <w:ins w:id="90" w:author="Benjamin J. Makhlouf" w:date="2026-06-18T19:48:00Z" w16du:dateUtc="2026-06-19T02:48:00Z">
+      <w:ins w:id="110" w:author="Benjamin J. Makhlouf" w:date="2026-06-18T19:48:00Z" w16du:dateUtc="2026-06-19T02:48:00Z">
         <w:r>
           <w:rPr>
             <w:rFonts w:ascii="Garamond" w:eastAsia="Times New Roman" w:hAnsi="Garamond" w:cs="Times New Roman"/>
@@ -2791,7 +2944,7 @@
           <w:t xml:space="preserve"> can be used as a proxy for Sr concentration, which is expected to be much higher in the marine environment as well as the materna</w:t>
         </w:r>
       </w:ins>
-      <w:ins w:id="91" w:author="Benjamin J. Makhlouf" w:date="2026-06-18T19:49:00Z" w16du:dateUtc="2026-06-19T02:49:00Z">
+      <w:ins w:id="111" w:author="Benjamin J. Makhlouf" w:date="2026-06-18T19:49:00Z" w16du:dateUtc="2026-06-19T02:49:00Z">
         <w:r>
           <w:rPr>
             <w:rFonts w:ascii="Garamond" w:eastAsia="Times New Roman" w:hAnsi="Garamond" w:cs="Times New Roman"/>
@@ -2801,7 +2954,7 @@
           <w:t xml:space="preserve">lly influenced core. As a result, the Sr88 signal of the otolith data was used to guide manual selection of the natal origin region following depletion of the maternal signature, indicated by decreased Sr88 concentrations. </w:t>
         </w:r>
       </w:ins>
-      <w:del w:id="92" w:author="Benjamin J. Makhlouf" w:date="2026-06-18T19:45:00Z" w16du:dateUtc="2026-06-19T02:45:00Z">
+      <w:del w:id="112" w:author="Benjamin J. Makhlouf" w:date="2026-06-18T19:45:00Z" w16du:dateUtc="2026-06-19T02:45:00Z">
         <w:r>
           <w:rPr>
             <w:rFonts w:ascii="Garamond" w:eastAsia="Times New Roman" w:hAnsi="Garamond" w:cs="Times New Roman"/>
@@ -3038,7 +3191,14 @@
         <w:rPr>
           <w:rFonts w:ascii="Garamond" w:hAnsi="Garamond" w:cs="Times New Roman"/>
         </w:rPr>
-        <w:t xml:space="preserve">To prevent over-assignment to tributaries with exceptionally low prediction error, uncertainty values were constrained to 0.0006 and above. This threshold was selected by visually examining the histogram for a cutoff which adjusted the values for a small number of exceedingly low uncertainty tributaries (those near extensive sampling) while maintaining the general error distribution from the original SSN model. </w:t>
+        <w:t xml:space="preserve">To prevent over-assignment to tributaries with exceptionally low prediction error, uncertainty values were constrained to 0.0006 and above. This threshold was selected by visually examining the histogram for a cutoff which adjusted the values for a small </w:t>
+      </w:r>
+      <w:r>
+        <w:rPr>
+          <w:rFonts w:ascii="Garamond" w:hAnsi="Garamond" w:cs="Times New Roman"/>
+        </w:rPr>
+        <w:lastRenderedPageBreak/>
+        <w:t xml:space="preserve">number of exceedingly low uncertainty tributaries (those near extensive sampling) while maintaining the general error distribution from the original SSN model. </w:t>
       </w:r>
     </w:p>
     <w:p>
@@ -3088,17 +3248,7 @@
           <w:kern w:val="0"/>
           <w14:ligatures w14:val="none"/>
         </w:rPr>
-        <w:t xml:space="preserve">(Brennan et </w:t>
-      </w:r>
-      <w:r>
-        <w:rPr>
-          <w:rFonts w:ascii="Garamond" w:eastAsia="Times New Roman" w:hAnsi="Garamond" w:cs="Times New Roman"/>
-          <w:noProof/>
-          <w:kern w:val="0"/>
-          <w14:ligatures w14:val="none"/>
-        </w:rPr>
-        <w:lastRenderedPageBreak/>
-        <w:t>al., 2019)</w:t>
+        <w:t>(Brennan et al., 2019)</w:t>
       </w:r>
       <w:r>
         <w:rPr>
@@ -3148,14 +3298,77 @@
           <w:kern w:val="0"/>
           <w14:ligatures w14:val="none"/>
         </w:rPr>
-        <w:t xml:space="preserve"> values as well as several variance generating processes including </w:t>
-      </w:r>
-      <w:r>
-        <w:rPr>
-          <w:rFonts w:ascii="Garamond" w:hAnsi="Garamond" w:cs="Times New Roman"/>
-        </w:rPr>
-        <w:t xml:space="preserve">analytical, within-population, and isoscape prediction errors. </w:t>
-      </w:r>
+        <w:t xml:space="preserve"> values as well as several variance generating processes</w:t>
+      </w:r>
+      <w:ins w:id="113" w:author="Benjamin J. Makhlouf" w:date="2026-06-22T08:33:00Z" w16du:dateUtc="2026-06-22T15:33:00Z">
+        <w:r>
+          <w:rPr>
+            <w:rFonts w:ascii="Garamond" w:eastAsia="Times New Roman" w:hAnsi="Garamond" w:cs="Times New Roman"/>
+            <w:kern w:val="0"/>
+            <w14:ligatures w14:val="none"/>
+          </w:rPr>
+          <w:t>.</w:t>
+        </w:r>
+      </w:ins>
+      <w:ins w:id="114" w:author="Benjamin J. Makhlouf" w:date="2026-06-22T08:49:00Z" w16du:dateUtc="2026-06-22T15:49:00Z">
+        <w:r>
+          <w:t xml:space="preserve"> </w:t>
+        </w:r>
+      </w:ins>
+      <w:ins w:id="115" w:author="Benjamin J. Makhlouf" w:date="2026-06-22T08:49:00Z">
+        <w:r>
+          <w:rPr>
+            <w:rFonts w:ascii="Garamond" w:eastAsia="Times New Roman" w:hAnsi="Garamond" w:cs="Times New Roman"/>
+            <w:kern w:val="0"/>
+            <w14:ligatures w14:val="none"/>
+          </w:rPr>
+          <w:t>These sources include analytical error (variation among repeated standard measurements; 0.000055), within-population error (variation among individuals at the same site; 0.00016), and isoscape error (uncertainty in isoscape model predictions; basin-wide mean = 0.00072)</w:t>
+        </w:r>
+      </w:ins>
+      <w:ins w:id="116" w:author="Benjamin J. Makhlouf" w:date="2026-06-22T10:03:00Z" w16du:dateUtc="2026-06-22T17:03:00Z">
+        <w:r>
+          <w:rPr>
+            <w:rFonts w:ascii="Garamond" w:eastAsia="Times New Roman" w:hAnsi="Garamond" w:cs="Times New Roman"/>
+            <w:kern w:val="0"/>
+            <w14:ligatures w14:val="none"/>
+          </w:rPr>
+          <w:t xml:space="preserve"> </w:t>
+        </w:r>
+      </w:ins>
+      <w:ins w:id="117" w:author="Benjamin J. Makhlouf" w:date="2026-06-22T10:05:00Z" w16du:dateUtc="2026-06-22T17:05:00Z">
+        <w:r>
+          <w:rPr>
+            <w:rFonts w:ascii="Garamond" w:eastAsia="Times New Roman" w:hAnsi="Garamond" w:cs="Times New Roman"/>
+            <w:kern w:val="0"/>
+            <w14:ligatures w14:val="none"/>
+          </w:rPr>
+          <w:t xml:space="preserve">(Brennan et al., 2015, French at al., X). </w:t>
+        </w:r>
+      </w:ins>
+      <w:del w:id="118" w:author="Benjamin J. Makhlouf" w:date="2026-06-22T08:33:00Z" w16du:dateUtc="2026-06-22T15:33:00Z">
+        <w:r>
+          <w:rPr>
+            <w:rFonts w:ascii="Garamond" w:eastAsia="Times New Roman" w:hAnsi="Garamond" w:cs="Times New Roman"/>
+            <w:kern w:val="0"/>
+            <w14:ligatures w14:val="none"/>
+          </w:rPr>
+          <w:delText xml:space="preserve"> including </w:delText>
+        </w:r>
+        <w:r>
+          <w:rPr>
+            <w:rFonts w:ascii="Garamond" w:hAnsi="Garamond" w:cs="Times New Roman"/>
+          </w:rPr>
+          <w:delText>analytical</w:delText>
+        </w:r>
+      </w:del>
+      <w:del w:id="119" w:author="Benjamin J. Makhlouf" w:date="2026-06-22T10:06:00Z" w16du:dateUtc="2026-06-22T17:06:00Z">
+        <w:r>
+          <w:rPr>
+            <w:rFonts w:ascii="Garamond" w:hAnsi="Garamond" w:cs="Times New Roman"/>
+          </w:rPr>
+          <w:delText xml:space="preserve">, within-population, and isoscape prediction errors. </w:delText>
+        </w:r>
+      </w:del>
       <w:r>
         <w:rPr>
           <w:rFonts w:ascii="Garamond" w:eastAsia="Times New Roman" w:hAnsi="Garamond" w:cs="Times New Roman"/>
@@ -3911,6 +4124,7 @@
           <w:kern w:val="0"/>
           <w14:ligatures w14:val="none"/>
         </w:rPr>
+        <w:lastRenderedPageBreak/>
         <w:t xml:space="preserve">Several priors were included to limit assignments to areas within the river basin suitable for spawning Chinook salmon. </w:t>
       </w:r>
       <w:r>
@@ -4073,16 +4287,7 @@
           <w:kern w:val="0"/>
           <w14:ligatures w14:val="none"/>
         </w:rPr>
-        <w:t xml:space="preserve">Finally, data were included on observed locations of Chinook spawners derived from USGS Arctic-Yukon-Kuskokwim (AYK) Chinook Salmon Intrinsic potential </w:t>
-      </w:r>
-      <w:r>
-        <w:rPr>
-          <w:rFonts w:ascii="Garamond" w:eastAsia="Times New Roman" w:hAnsi="Garamond" w:cs="Times New Roman"/>
-          <w:kern w:val="0"/>
-          <w14:ligatures w14:val="none"/>
-        </w:rPr>
-        <w:lastRenderedPageBreak/>
-        <w:t xml:space="preserve">mapping, which synthesized several sources of data on observed Chinook salmon spawners into spatially referenced tributary data on the presence or absence of observations </w:t>
+        <w:t xml:space="preserve">Finally, data were included on observed locations of Chinook spawners derived from USGS Arctic-Yukon-Kuskokwim (AYK) Chinook Salmon Intrinsic potential mapping, which synthesized several sources of data on observed Chinook salmon spawners into spatially referenced tributary data on the presence or absence of observations </w:t>
       </w:r>
       <w:r>
         <w:rPr>
@@ -4156,7 +4361,49 @@
         <w:rPr>
           <w:rFonts w:ascii="Garamond" w:hAnsi="Garamond" w:cs="Times New Roman"/>
         </w:rPr>
-        <w:t xml:space="preserve">To estimate the spatial distribution of returns across a subset of the population, posterior probability values for all individuals in that subset were summed at each location. Before summing, only highly likely locations (the top 30% of posterior values) were retained, whereas all other values were assigned a value of zero </w:t>
+        <w:t xml:space="preserve">To estimate the spatial distribution of returns across a </w:t>
+      </w:r>
+      <w:ins w:id="120" w:author="Benjamin J. Makhlouf" w:date="2026-06-22T10:08:00Z" w16du:dateUtc="2026-06-22T17:08:00Z">
+        <w:r>
+          <w:rPr>
+            <w:rFonts w:ascii="Garamond" w:hAnsi="Garamond" w:cs="Times New Roman"/>
+          </w:rPr>
+          <w:t xml:space="preserve">temporal </w:t>
+        </w:r>
+      </w:ins>
+      <w:r>
+        <w:rPr>
+          <w:rFonts w:ascii="Garamond" w:hAnsi="Garamond" w:cs="Times New Roman"/>
+        </w:rPr>
+        <w:t>subset of the</w:t>
+      </w:r>
+      <w:ins w:id="121" w:author="Benjamin J. Makhlouf" w:date="2026-06-22T10:08:00Z" w16du:dateUtc="2026-06-22T17:08:00Z">
+        <w:r>
+          <w:rPr>
+            <w:rFonts w:ascii="Garamond" w:hAnsi="Garamond" w:cs="Times New Roman"/>
+          </w:rPr>
+          <w:t xml:space="preserve"> full return</w:t>
+        </w:r>
+        <w:r>
+          <w:rPr>
+            <w:rFonts w:ascii="Garamond" w:hAnsi="Garamond" w:cs="Times New Roman"/>
+          </w:rPr>
+          <w:t xml:space="preserve"> migration</w:t>
+        </w:r>
+      </w:ins>
+      <w:del w:id="122" w:author="Benjamin J. Makhlouf" w:date="2026-06-22T10:08:00Z" w16du:dateUtc="2026-06-22T17:08:00Z">
+        <w:r>
+          <w:rPr>
+            <w:rFonts w:ascii="Garamond" w:hAnsi="Garamond" w:cs="Times New Roman"/>
+          </w:rPr>
+          <w:delText xml:space="preserve"> population</w:delText>
+        </w:r>
+      </w:del>
+      <w:r>
+        <w:rPr>
+          <w:rFonts w:ascii="Garamond" w:hAnsi="Garamond" w:cs="Times New Roman"/>
+        </w:rPr>
+        <w:t xml:space="preserve">, posterior probability values for all individuals in that subset were summed at each location. Before summing, only highly likely locations (the top 30% of posterior values) were retained, whereas all other values were assigned a value of zero </w:t>
       </w:r>
       <w:r>
         <w:rPr>
@@ -4195,7 +4442,7 @@
         </w:rPr>
         <w:t xml:space="preserve">. We produced these estimates for four predefined temporal </w:t>
       </w:r>
-      <w:ins w:id="93" w:author="Benjamin J. Makhlouf" w:date="2026-06-19T06:36:00Z" w16du:dateUtc="2026-06-19T13:36:00Z">
+      <w:ins w:id="123" w:author="Benjamin J. Makhlouf" w:date="2026-06-19T06:36:00Z" w16du:dateUtc="2026-06-19T13:36:00Z">
         <w:r>
           <w:rPr>
             <w:rFonts w:ascii="Garamond" w:hAnsi="Garamond" w:cs="Times New Roman"/>
@@ -4203,7 +4450,7 @@
           <w:t xml:space="preserve">ranges that roughly represent quartiles of the </w:t>
         </w:r>
       </w:ins>
-      <w:del w:id="94" w:author="Benjamin J. Makhlouf" w:date="2026-06-19T06:36:00Z" w16du:dateUtc="2026-06-19T13:36:00Z">
+      <w:del w:id="124" w:author="Benjamin J. Makhlouf" w:date="2026-06-19T06:36:00Z" w16du:dateUtc="2026-06-19T13:36:00Z">
         <w:r>
           <w:rPr>
             <w:rFonts w:ascii="Garamond" w:hAnsi="Garamond" w:cs="Times New Roman"/>
@@ -4217,7 +4464,7 @@
         </w:rPr>
         <w:t xml:space="preserve"> of the salmon migration season based on capture date: Q1 (run start through June 11), Q2 (June 12-21), Q3 (June 22-July 1), and Q4 (July 2 onward). These dates were chosen to roughly split the full run </w:t>
       </w:r>
-      <w:ins w:id="95" w:author="Benjamin J. Makhlouf" w:date="2026-06-19T06:37:00Z" w16du:dateUtc="2026-06-19T13:37:00Z">
+      <w:ins w:id="125" w:author="Benjamin J. Makhlouf" w:date="2026-06-19T06:37:00Z" w16du:dateUtc="2026-06-19T13:37:00Z">
         <w:r>
           <w:rPr>
             <w:rFonts w:ascii="Garamond" w:hAnsi="Garamond" w:cs="Times New Roman"/>
@@ -4225,7 +4472,7 @@
           <w:t>evenly into equal quartiles</w:t>
         </w:r>
       </w:ins>
-      <w:del w:id="96" w:author="Benjamin J. Makhlouf" w:date="2026-06-19T06:37:00Z" w16du:dateUtc="2026-06-19T13:37:00Z">
+      <w:del w:id="126" w:author="Benjamin J. Makhlouf" w:date="2026-06-19T06:37:00Z" w16du:dateUtc="2026-06-19T13:37:00Z">
         <w:r>
           <w:rPr>
             <w:rFonts w:ascii="Garamond" w:hAnsi="Garamond" w:cs="Times New Roman"/>
@@ -4239,7 +4486,7 @@
         </w:rPr>
         <w:t>while allowing for direct comparison among years.</w:t>
       </w:r>
-      <w:ins w:id="97" w:author="Benjamin J. Makhlouf" w:date="2026-06-19T06:37:00Z" w16du:dateUtc="2026-06-19T13:37:00Z">
+      <w:ins w:id="127" w:author="Benjamin J. Makhlouf" w:date="2026-06-19T06:37:00Z" w16du:dateUtc="2026-06-19T13:37:00Z">
         <w:r>
           <w:rPr>
             <w:rFonts w:ascii="Garamond" w:hAnsi="Garamond" w:cs="Times New Roman"/>
@@ -4247,7 +4494,7 @@
           <w:t xml:space="preserve"> However, because the start and end date of the return migration varied among years, the duration of Q1 and Q4 varied</w:t>
         </w:r>
       </w:ins>
-      <w:ins w:id="98" w:author="Benjamin J. Makhlouf" w:date="2026-06-19T06:38:00Z" w16du:dateUtc="2026-06-19T13:38:00Z">
+      <w:ins w:id="128" w:author="Benjamin J. Makhlouf" w:date="2026-06-19T06:38:00Z" w16du:dateUtc="2026-06-19T13:38:00Z">
         <w:r>
           <w:rPr>
             <w:rFonts w:ascii="Garamond" w:hAnsi="Garamond" w:cs="Times New Roman"/>
@@ -4259,7 +4506,14 @@
         <w:rPr>
           <w:rFonts w:ascii="Garamond" w:hAnsi="Garamond" w:cs="Times New Roman"/>
         </w:rPr>
-        <w:t xml:space="preserve"> The June 11 date was chosen specifically to match the end of the ‘front end closure’ of the subsistence fishery. Estimates were also produced for the full run in each year. </w:t>
+        <w:t xml:space="preserve"> The June 11 date was chosen specifically to </w:t>
+      </w:r>
+      <w:r>
+        <w:rPr>
+          <w:rFonts w:ascii="Garamond" w:hAnsi="Garamond" w:cs="Times New Roman"/>
+        </w:rPr>
+        <w:lastRenderedPageBreak/>
+        <w:t xml:space="preserve">match the end of the ‘front end closure’ of the subsistence fishery. Estimates were also produced for the full run in each year. </w:t>
       </w:r>
     </w:p>
     <w:p>
@@ -4270,7 +4524,7 @@
           <w:rFonts w:ascii="Garamond" w:hAnsi="Garamond" w:cs="Times New Roman"/>
         </w:rPr>
       </w:pPr>
-      <w:ins w:id="99" w:author="Benjamin J. Makhlouf" w:date="2026-06-19T07:16:00Z">
+      <w:ins w:id="129" w:author="Benjamin J. Makhlouf" w:date="2026-06-19T07:16:00Z">
         <w:r>
           <w:rPr>
             <w:rFonts w:ascii="Garamond" w:hAnsi="Garamond" w:cs="Times New Roman"/>
@@ -4278,7 +4532,7 @@
           <w:t>Several major tributaries were identified as focal management areas or important Chinook salmon-producing systems within the Kuskokwim River basin based on expert knowledge and consultation with regional collaborators.</w:t>
         </w:r>
       </w:ins>
-      <w:del w:id="100" w:author="Benjamin J. Makhlouf" w:date="2026-06-19T07:16:00Z" w16du:dateUtc="2026-06-19T14:16:00Z">
+      <w:del w:id="130" w:author="Benjamin J. Makhlouf" w:date="2026-06-19T07:16:00Z" w16du:dateUtc="2026-06-19T14:16:00Z">
         <w:r>
           <w:rPr>
             <w:rFonts w:ascii="Garamond" w:hAnsi="Garamond" w:cs="Times New Roman"/>
@@ -4299,17 +4553,7 @@
           <w:sz w:val="24"/>
           <w:szCs w:val="24"/>
         </w:rPr>
-        <w:t xml:space="preserve"> the furthest downstream connection of each of these tributaries to the mainstem Kuskokwim River, all upstream segments were identified and assigned to a common identifier based on the name of the major tributary. Areas of the basin which were not assigned a unit identifier (e.g. </w:t>
-      </w:r>
-      <w:r>
-        <w:rPr>
-          <w:rStyle w:val="CommentReference"/>
-          <w:rFonts w:ascii="Garamond" w:hAnsi="Garamond" w:cs="Times New Roman"/>
-          <w:sz w:val="24"/>
-          <w:szCs w:val="24"/>
-        </w:rPr>
-        <w:lastRenderedPageBreak/>
-        <w:t xml:space="preserve">portions of the mainstem Kuskokwim) were grouped into regions of comparable size and spatial relevance to ensure complete basin coverage above the location of the test fishery (Fig. 2a). </w:t>
+        <w:t xml:space="preserve"> the furthest downstream connection of each of these tributaries to the mainstem Kuskokwim River, all upstream segments were identified and assigned to a common identifier based on the name of the major tributary. Areas of the basin which were not assigned a unit identifier (e.g. portions of the mainstem Kuskokwim) were grouped into regions of comparable size and spatial relevance to ensure complete basin coverage above the location of the test fishery (Fig. 2a). </w:t>
       </w:r>
       <w:r>
         <w:rPr>
@@ -4341,7 +4585,29 @@
         <w:rPr>
           <w:rFonts w:ascii="Garamond" w:hAnsi="Garamond" w:cs="Times New Roman"/>
         </w:rPr>
-        <w:t xml:space="preserve">Sr values found in each. We then evaluated the clustering results for a range of cluster numbers (n = 2-6) using the silhouette score, which measures cluster quality by comparing within-cluster versus between-cluster distances. From this metric we selected n = 6, which maintained a high silhouette score while providing finer isotopic resolution across groups. The resulting regional groupings displayed a general pattern from upstream to downstream regions (Fig. 2b). However, K-means clustering placed the South Fork Kuskokwim in a lower watershed group because of a very small number of enriched tributaries at the headwaters of this group. Based on an evaluation of the overall isotopic composition compared to other nearby tributary groups, we manually added the South Fork Kuskokwim to its nearest watershed group, group five. </w:t>
+        <w:t xml:space="preserve">Sr values found in each. We then evaluated the clustering results for a range of cluster numbers (n = 2-6) using the silhouette score, which measures cluster quality by comparing within-cluster versus between-cluster distances. From this metric we selected n = 6, which maintained a high silhouette score while providing finer isotopic resolution across groups. The resulting regional groupings displayed a general pattern from upstream to downstream regions (Fig. 2b). However, K-means clustering placed the South Fork Kuskokwim in a lower watershed group because of a very small number of enriched tributaries at the headwaters of this group. Based on an evaluation of the overall isotopic composition compared to other nearby tributary groups, we manually added the South Fork Kuskokwim to its nearest watershed group, group </w:t>
+      </w:r>
+      <w:ins w:id="131" w:author="Benjamin J. Makhlouf" w:date="2026-06-22T10:17:00Z" w16du:dateUtc="2026-06-22T17:17:00Z">
+        <w:r>
+          <w:rPr>
+            <w:rFonts w:ascii="Garamond" w:hAnsi="Garamond" w:cs="Times New Roman"/>
+          </w:rPr>
+          <w:t>two</w:t>
+        </w:r>
+      </w:ins>
+      <w:del w:id="132" w:author="Benjamin J. Makhlouf" w:date="2026-06-22T10:17:00Z" w16du:dateUtc="2026-06-22T17:17:00Z">
+        <w:r>
+          <w:rPr>
+            <w:rFonts w:ascii="Garamond" w:hAnsi="Garamond" w:cs="Times New Roman"/>
+          </w:rPr>
+          <w:delText>five</w:delText>
+        </w:r>
+      </w:del>
+      <w:r>
+        <w:rPr>
+          <w:rFonts w:ascii="Garamond" w:hAnsi="Garamond" w:cs="Times New Roman"/>
+        </w:rPr>
+        <w:t xml:space="preserve">. </w:t>
       </w:r>
     </w:p>
     <w:p>
@@ -4374,14 +4640,22 @@
         <w:rPr>
           <w:rFonts w:ascii="Garamond" w:hAnsi="Garamond" w:cs="Times New Roman"/>
         </w:rPr>
-        <w:t xml:space="preserve">For each year and seasonal quartile, tributary-level return estimates were aggregated into the six regional groups and normalized to sum to one across the basin, representing each group’s proportional contribution to that quartile. Summary statistics were then calculated across all years for each group (Fig. 3). Cumulative distribution functions were constructed to examine trends in relative run timing among regional groups independent of abundance and quartile cut-off dates. For each year, the full run was split into three-day intervals and the cumulative number of returners for each group was compared to its full season contribution. To directly compare relative run timing to the temporal distribution of the full run, we used daily CPUE data collected from the BTF to calculate the cumulative proportion of the full run’s CPUE remaining for each day. This value </w:t>
-      </w:r>
-      <w:r>
-        <w:rPr>
-          <w:rFonts w:ascii="Garamond" w:hAnsi="Garamond" w:cs="Times New Roman"/>
-        </w:rPr>
         <w:lastRenderedPageBreak/>
-        <w:t xml:space="preserve">represents the maximum potential harvest available if harvest rates are proportional to CPUE. However, this value does not account for the preferred harvest timing without the closure implemented, which may not follow this pattern. Resulting data (Fig. 4) illustrate the proportion (from zero to one) of each group’s total cumulative contribution to the overall run at each three-day interval as well as the proportion of the total potential harvest remaining for each day. </w:t>
+        <w:t>For each year and seasonal quartile, tributary-level return estimates were aggregated into the six regional groups and normalized to sum to one across the basin, representing each group’s proportional contribution to that quartile. Summary statistics were then calculated across all years for each group (Fig. 3). Cumulative distribution functions were constructed to examine trends in relative run timing among regional groups independent of abundance and quartile cut-off dates. For each year, the full run was split into three-day intervals and the cumulative number of returners for each group was compared to its full season contribution. To directly compare relative run timing to the temporal distribution of the full run, we used daily CPUE data collected from the BTF to calculate the cumulative proportion of the full run’s CPUE remaining for each day</w:t>
+      </w:r>
+      <w:ins w:id="133" w:author="Benjamin J. Makhlouf" w:date="2026-06-22T10:23:00Z" w16du:dateUtc="2026-06-22T17:23:00Z">
+        <w:r>
+          <w:rPr>
+            <w:rFonts w:ascii="Garamond" w:hAnsi="Garamond" w:cs="Times New Roman"/>
+          </w:rPr>
+          <w:t xml:space="preserve"> based on the sum of the daily CPUE</w:t>
+        </w:r>
+      </w:ins>
+      <w:r>
+        <w:rPr>
+          <w:rFonts w:ascii="Garamond" w:hAnsi="Garamond" w:cs="Times New Roman"/>
+        </w:rPr>
+        <w:t xml:space="preserve">. This value represents the maximum potential harvest available if harvest rates are proportional to CPUE. However, this value does not account for the preferred harvest timing without the closure implemented, which may not follow this pattern. Resulting data (Fig. 4) illustrate the proportion (from zero to one) of each group’s total cumulative contribution to the overall run at each three-day interval as well as the proportion of the total potential harvest remaining for each day. </w:t>
       </w:r>
     </w:p>
     <w:p>
@@ -4389,14 +4663,107 @@
         <w:spacing w:line="480" w:lineRule="auto"/>
         <w:ind w:firstLine="720"/>
         <w:rPr>
-          <w:rFonts w:ascii="Garamond" w:hAnsi="Garamond" w:cs="Times New Roman"/>
-        </w:rPr>
-      </w:pPr>
-      <w:r>
-        <w:rPr>
-          <w:rFonts w:ascii="Garamond" w:hAnsi="Garamond"/>
-        </w:rPr>
-        <w:t>To assess the impact of the existing front-end closure, we quantified the share of each group’s total annual return that fell within the closure period (the first seasonal quartile, Q1 in our dataset). This comparison illustrates the maximum degree of protection provided to each stock group by estimating the portion of its annual run excluded from harvest</w:t>
+          <w:rFonts w:ascii="Garamond" w:hAnsi="Garamond"/>
+        </w:rPr>
+      </w:pPr>
+      <w:r>
+        <w:rPr>
+          <w:rFonts w:ascii="Garamond" w:hAnsi="Garamond"/>
+        </w:rPr>
+        <w:t xml:space="preserve">To assess the impact of the existing front-end closure, we quantified the </w:t>
+      </w:r>
+      <w:ins w:id="134" w:author="Benjamin J. Makhlouf" w:date="2026-06-20T15:18:00Z">
+        <w:r>
+          <w:rPr>
+            <w:rFonts w:ascii="Garamond" w:hAnsi="Garamond"/>
+          </w:rPr>
+          <w:t>proportion of total abundance occurring within the closure period (corresponding to the first seasonal quartile, Q1, in our dataset) that was assigned to each regional group based on otolith</w:t>
+        </w:r>
+      </w:ins>
+      <w:ins w:id="135" w:author="Benjamin J. Makhlouf" w:date="2026-06-20T15:20:00Z" w16du:dateUtc="2026-06-20T22:20:00Z">
+        <w:r>
+          <w:rPr>
+            <w:rFonts w:ascii="Garamond" w:hAnsi="Garamond"/>
+          </w:rPr>
+          <w:t xml:space="preserve"> isotope</w:t>
+        </w:r>
+      </w:ins>
+      <w:ins w:id="136" w:author="Benjamin J. Makhlouf" w:date="2026-06-20T15:18:00Z">
+        <w:r>
+          <w:rPr>
+            <w:rFonts w:ascii="Garamond" w:hAnsi="Garamond"/>
+          </w:rPr>
+          <w:t xml:space="preserve"> assignments. We refer to this metric</w:t>
+        </w:r>
+      </w:ins>
+      <w:ins w:id="137" w:author="Benjamin J. Makhlouf" w:date="2026-06-20T15:20:00Z" w16du:dateUtc="2026-06-20T22:20:00Z">
+        <w:r>
+          <w:rPr>
+            <w:rFonts w:ascii="Garamond" w:hAnsi="Garamond"/>
+          </w:rPr>
+          <w:t xml:space="preserve"> hereafter</w:t>
+        </w:r>
+      </w:ins>
+      <w:ins w:id="138" w:author="Benjamin J. Makhlouf" w:date="2026-06-20T15:18:00Z">
+        <w:r>
+          <w:rPr>
+            <w:rFonts w:ascii="Garamond" w:hAnsi="Garamond"/>
+          </w:rPr>
+          <w:t xml:space="preserve"> as </w:t>
+        </w:r>
+      </w:ins>
+      <w:ins w:id="139" w:author="Benjamin J. Makhlouf" w:date="2026-06-20T15:20:00Z" w16du:dateUtc="2026-06-20T22:20:00Z">
+        <w:r>
+          <w:rPr>
+            <w:rFonts w:ascii="Garamond" w:hAnsi="Garamond"/>
+          </w:rPr>
+          <w:t>“</w:t>
+        </w:r>
+      </w:ins>
+      <w:ins w:id="140" w:author="Benjamin J. Makhlouf" w:date="2026-06-20T15:18:00Z">
+        <w:r>
+          <w:rPr>
+            <w:rFonts w:ascii="Garamond" w:hAnsi="Garamond"/>
+            <w:rPrChange w:id="141" w:author="Benjamin J. Makhlouf" w:date="2026-06-20T15:19:00Z" w16du:dateUtc="2026-06-20T22:19:00Z">
+              <w:rPr>
+                <w:rFonts w:ascii="Garamond" w:hAnsi="Garamond"/>
+                <w:b/>
+                <w:bCs/>
+              </w:rPr>
+            </w:rPrChange>
+          </w:rPr>
+          <w:t>percent protection</w:t>
+        </w:r>
+      </w:ins>
+      <w:ins w:id="142" w:author="Benjamin J. Makhlouf" w:date="2026-06-20T15:20:00Z" w16du:dateUtc="2026-06-20T22:20:00Z">
+        <w:r>
+          <w:rPr>
+            <w:rFonts w:ascii="Garamond" w:hAnsi="Garamond"/>
+          </w:rPr>
+          <w:t>”</w:t>
+        </w:r>
+      </w:ins>
+      <w:ins w:id="143" w:author="Benjamin J. Makhlouf" w:date="2026-06-20T15:18:00Z">
+        <w:r>
+          <w:rPr>
+            <w:rFonts w:ascii="Garamond" w:hAnsi="Garamond"/>
+          </w:rPr>
+          <w:t>.</w:t>
+        </w:r>
+      </w:ins>
+      <w:del w:id="144" w:author="Benjamin J. Makhlouf" w:date="2026-06-20T15:17:00Z" w16du:dateUtc="2026-06-20T22:17:00Z">
+        <w:r>
+          <w:rPr>
+            <w:rFonts w:ascii="Garamond" w:hAnsi="Garamond"/>
+          </w:rPr>
+          <w:delText>share of each group’s total annual return that fell within the closure period (the first seasonal quartile, Q1 in our dataset</w:delText>
+        </w:r>
+      </w:del>
+      <w:r>
+        <w:rPr>
+          <w:rFonts w:ascii="Garamond" w:hAnsi="Garamond"/>
+        </w:rPr>
+        <w:t>). This comparison illustrates the maximum degree of protection provided to each stock group by estimating the portion of its annual run excluded from harvest</w:t>
       </w:r>
       <w:r>
         <w:rPr>
@@ -4428,7 +4795,14 @@
         <w:rPr>
           <w:rFonts w:ascii="Garamond" w:hAnsi="Garamond" w:cs="Times New Roman"/>
         </w:rPr>
-        <w:t xml:space="preserve"> (three days after current closure end date), and June 17</w:t>
+        <w:t xml:space="preserve"> (three days after current closure end </w:t>
+      </w:r>
+      <w:r>
+        <w:rPr>
+          <w:rFonts w:ascii="Garamond" w:hAnsi="Garamond" w:cs="Times New Roman"/>
+        </w:rPr>
+        <w:lastRenderedPageBreak/>
+        <w:t>date), and June 17</w:t>
       </w:r>
       <w:r>
         <w:rPr>
@@ -4514,14 +4888,7 @@
         <w:rPr>
           <w:rFonts w:ascii="Garamond" w:hAnsi="Garamond"/>
         </w:rPr>
-        <w:t xml:space="preserve">Across all years of our dataset (2017-2022), returns to the six regional groups exhibited a general transition from the furthest upstream to the furthest downstream as the season progressed (Fig. 3). Notably, group one, which contains the North Fork and East Fork Kuskokwim River, </w:t>
-      </w:r>
-      <w:r>
-        <w:rPr>
-          <w:rFonts w:ascii="Garamond" w:hAnsi="Garamond"/>
-        </w:rPr>
-        <w:lastRenderedPageBreak/>
-        <w:t>consistently contributed little to all years and quartiles (max: 2.9%). Early season returns (Q1: start of run through June 11, Fig. 3a.) were represented primarily by high contributions from group two (median: 42.2%), with relatively low median contribution (20% or less) from all other groups. The second quartile (June 12</w:t>
+        <w:t>Across all years of our dataset (2017-2022), returns to the six regional groups exhibited a general transition from the furthest upstream to the furthest downstream as the season progressed (Fig. 3). Notably, group one, which contains the North Fork and East Fork Kuskokwim River, consistently contributed little to all years and quartiles (max: 2.9%). Early season returns (Q1: start of run through June 11, Fig. 3a.) were represented primarily by high contributions from group two (median: 42.2%), with relatively low median contribution (20% or less) from all other groups. The second quartile (June 12</w:t>
       </w:r>
       <w:r>
         <w:rPr>
@@ -4604,6 +4971,7 @@
         <w:rPr>
           <w:rFonts w:ascii="Garamond" w:hAnsi="Garamond"/>
         </w:rPr>
+        <w:lastRenderedPageBreak/>
         <w:t>Cumulative distribution plots (Fig. 4) illustrated variation in seasonal migration timing among regional groups independent of the total returning individuals within each group. In each year, upper watershed individuals arrived earlier in the season, whereas further downstream groups returned later. There was some variability in run timing among middle/lower watershed groups, however, a clear pattern in run timing between the upper and lower portions of the watershed was evident despite differences in the average migration timing and temporal distribution of the run (i.e. compressed vs. protracted run timing) (Fig. 4, gray solid line). The proportion of total CPUE remaining at the front-end closure date (dashed gray line, Fig. 4) varied substantially among years. In some years, nearly the entire run had yet to arrive by the closure date (e.g., 2017), whereas in others, almost 25% of the total return occurred before the closure end date.</w:t>
       </w:r>
     </w:p>
@@ -4637,7 +5005,6 @@
         <w:rPr>
           <w:rFonts w:ascii="Garamond" w:hAnsi="Garamond"/>
         </w:rPr>
-        <w:lastRenderedPageBreak/>
         <w:t xml:space="preserve">Early returning upper Kuskokwim populations were afforded higher proportional protection through the implementation of a front-end closure management strategy (Fig. 5). On average, group one, comprised of the furthest upstream populations, received 22.6% of its total contribution within the front-end closure window, followed by group two at 13.5%. In contrast, populations in further downstream areas received considerably less protection, with less than 10% protection afforded to groups three through six on average. These downstream groups also displayed a much narrower range of protection values across all years of our dataset: proportional protection ranged from 1.0%–14% for groups four through six and 1.7%–19% for group three. In contrast, upstream groups displayed a much larger range of protection across our dataset, with group two ranging from 2.4%–29.4% and group one ranging from 3%–52% of the overall return protected by the front-end closure. </w:t>
       </w:r>
     </w:p>
@@ -4654,16 +5021,17 @@
         <w:rPr>
           <w:rFonts w:ascii="Garamond" w:hAnsi="Garamond"/>
         </w:rPr>
+        <w:lastRenderedPageBreak/>
         <w:t xml:space="preserve">Varying the duration of the front-end closure did not change the overall pattern of higher protection afforded to upstream populations. However, an earlier closure date (June 8th) markedly decreased both the median and range of protection for upstream groups; median protection for groups one and two dropped to 5.4% and 6.7%, respectively. In at least one year of our dataset, ending the front-end closure three days early resulted in &lt;1% protection for all groups, and no group received greater than 20% protection in any year. In contrast, extending the front-end closure later than the current date increased median protection across all groups. Groups one and two saw an increase of </w:t>
       </w:r>
-      <w:bookmarkStart w:id="101" w:name="_Hlk213834610"/>
+      <w:bookmarkStart w:id="145" w:name="_Hlk213834610"/>
       <w:r>
         <w:rPr>
           <w:rFonts w:ascii="Garamond" w:hAnsi="Garamond"/>
         </w:rPr>
         <w:t xml:space="preserve">17.4% and 9.1% in median protection, respectively, by extending the front-end closure three days and the same groups saw a 32.3% and 21.3% </w:t>
       </w:r>
-      <w:bookmarkEnd w:id="101"/>
+      <w:bookmarkEnd w:id="145"/>
       <w:r>
         <w:rPr>
           <w:rFonts w:ascii="Garamond" w:hAnsi="Garamond"/>
@@ -4681,14 +5049,7 @@
         <w:rPr>
           <w:rFonts w:ascii="Garamond" w:hAnsi="Garamond"/>
         </w:rPr>
-        <w:t xml:space="preserve">, the lowest protection afforded to groups one and two </w:t>
-      </w:r>
-      <w:r>
-        <w:rPr>
-          <w:rFonts w:ascii="Garamond" w:hAnsi="Garamond"/>
-        </w:rPr>
-        <w:lastRenderedPageBreak/>
-        <w:t>was 7.8% and 4.4%, respectively, which are only 4.4% and 2.0% increases over the original closure date. By extending the closure by six days (June 17</w:t>
+        <w:t>, the lowest protection afforded to groups one and two was 7.8% and 4.4%, respectively, which are only 4.4% and 2.0% increases over the original closure date. By extending the closure by six days (June 17</w:t>
       </w:r>
       <w:r>
         <w:rPr>
@@ -4749,6 +5110,7 @@
         <w:rPr>
           <w:rFonts w:ascii="Garamond" w:hAnsi="Garamond"/>
         </w:rPr>
+        <w:lastRenderedPageBreak/>
         <w:t>The results presented here illustrate the most recent and comprehensive basin-wide quantification of the spatiotemporal patterns of Chinook salmon migrating into the Kuskokwim River. Our data corroborate previously observed relationships between run timing and watershed position of spawning habitat, wherein the earliest returning fish contribute to watersheds in the uppermost portions and the latest returning fish return to the furthest downstream portions of the watershed. This relationship was consistent throughout our multi-year dataset, emphasizing the consistency of this pattern across several generations despite variation in the overall migration timing and abundance.</w:t>
       </w:r>
     </w:p>
@@ -4783,14 +5145,7 @@
         <w:rPr>
           <w:rFonts w:ascii="Garamond" w:hAnsi="Garamond"/>
         </w:rPr>
-        <w:t xml:space="preserve">in the upper watershed. Upper Kuskokwim groups contributed substantially to early-season migrants (i.e. group two); however, the furthest upstream populations (group one) </w:t>
-      </w:r>
-      <w:r>
-        <w:rPr>
-          <w:rFonts w:ascii="Garamond" w:hAnsi="Garamond"/>
-        </w:rPr>
-        <w:lastRenderedPageBreak/>
-        <w:t xml:space="preserve">consistently represented only a small portion of total basin-wide returns in our dataset. Despite this variation in abundance, individuals in both upper watershed groups returned early in the migration season. As such, the front-end closure strategy as it is currently implemented provides harvest protection to upper watershed populations regardless of their overall abundance. For relatively small stocks such as those found in group one, this strategy may be particularly important for preserving biodiversity by preventing overharvest very early in the season when they may be co-migrating with much more abundant populations such as those in group two. Protecting these populations, despite relatively low returns, </w:t>
+        <w:t xml:space="preserve">in the upper watershed. Upper Kuskokwim groups contributed substantially to early-season migrants (i.e. group two); however, the furthest upstream populations (group one) consistently represented only a small portion of total basin-wide returns in our dataset. Despite this variation in abundance, individuals in both upper watershed groups returned early in the migration season. As such, the front-end closure strategy as it is currently implemented provides harvest protection to upper watershed populations regardless of their overall abundance. For relatively small stocks such as those found in group one, this strategy may be particularly important for preserving biodiversity by preventing overharvest very early in the season when they may be co-migrating with much more abundant populations such as those in group two. Protecting these populations, despite relatively low returns, </w:t>
       </w:r>
       <w:r>
         <w:rPr>
@@ -4867,6 +5222,7 @@
         <w:rPr>
           <w:rFonts w:ascii="Garamond" w:hAnsi="Garamond"/>
         </w:rPr>
+        <w:lastRenderedPageBreak/>
         <w:t xml:space="preserve">Despite a consistent overall relationship between watershed position and migration timing, we observed substantial interannual variability in both the proportional contributions of regional groups to the total run and the proportional protection afforded by the front-end closure strategy. Variability in spatial patterns of production aligns with well-documented variability in salmon life histories and previously observed shifts in habitat use across annual timescales </w:t>
       </w:r>
       <w:r>
@@ -4904,14 +5260,7 @@
         <w:rPr>
           <w:rFonts w:ascii="Garamond" w:hAnsi="Garamond"/>
         </w:rPr>
-        <w:t xml:space="preserve">. However, variability in the efficacy of the front-end closure also likely reflects the interaction between run dynamics and management strategies that operate on a fixed calendar date. Because the closure is implemented on a fixed schedule, interannual variation in migration timing means that the proportion of the run occurring within the closure window depends on both the timing (early vs. late) and duration (compressed vs. protracted) of the overall migration. Late return timing or extended run duration may result in less proportional contribution within the closure window as compared to earlier returning and less protracted run timing. As a result, both the amount and distribution of populations afforded protection depend on this interaction. When </w:t>
-      </w:r>
-      <w:r>
-        <w:rPr>
-          <w:rFonts w:ascii="Garamond" w:hAnsi="Garamond"/>
-        </w:rPr>
-        <w:lastRenderedPageBreak/>
-        <w:t xml:space="preserve">combined with natural variability in basin-wide production patterns, this may introduce substantial variability in the population-specific effect of the front-end closure. These results suggest a potential limitation of a fixed date closure and highlight the difficulty of managing for a dynamic ecosystem with fixed-duration management. A more dynamic closure which is responsive to predicted or observed run dynamics may provide more consistent protection to upstream populations. Improvement of run timing forecasts </w:t>
+        <w:t xml:space="preserve">. However, variability in the efficacy of the front-end closure also likely reflects the interaction between run dynamics and management strategies that operate on a fixed calendar date. Because the closure is implemented on a fixed schedule, interannual variation in migration timing means that the proportion of the run occurring within the closure window depends on both the timing (early vs. late) and duration (compressed vs. protracted) of the overall migration. Late return timing or extended run duration may result in less proportional contribution within the closure window as compared to earlier returning and less protracted run timing. As a result, both the amount and distribution of populations afforded protection depend on this interaction. When combined with natural variability in basin-wide production patterns, this may introduce substantial variability in the population-specific effect of the front-end closure. These results suggest a potential limitation of a fixed date closure and highlight the difficulty of managing for a dynamic ecosystem with fixed-duration management. A more dynamic closure which is responsive to predicted or observed run dynamics may provide more consistent protection to upstream populations. Improvement of run timing forecasts </w:t>
       </w:r>
       <w:r>
         <w:rPr>
@@ -4967,6 +5316,7 @@
         <w:rPr>
           <w:rFonts w:ascii="Garamond" w:hAnsi="Garamond"/>
         </w:rPr>
+        <w:lastRenderedPageBreak/>
         <w:t xml:space="preserve">Simulated changes to the front-end closure duration increased the average protection afforded to several regional groups, with a six-day extension from the current end date resulting in increased protection to regional groups one and two by 32.3% and 21.3%. However, increasing the duration of the closure did not result in high protection in all years. In both the three and six-day extension scenarios, several years of data displayed moderately low protection in years where the average run timing was relatively late, reiterating the challenge of estimating the population specific impacts even with a longer duration closure window. In addition, management decisions must consider the dual goals of maintaining both biodiversity and harvest opportunity. As currently implemented, the front-end closure on the Kuskokwim resulted in 12% of the total potential harvest falling within the closure window. Although the three-day and six-day extensions did improve both the minimum and average protection afforded to upper watershed groups, they also resulted in an additional 6% and 14% of the potential harvest falling within the closure window. </w:t>
       </w:r>
     </w:p>
@@ -4983,14 +5333,14 @@
         <w:rPr>
           <w:rFonts w:ascii="Garamond" w:hAnsi="Garamond"/>
         </w:rPr>
-        <w:t xml:space="preserve">Protecting upper Kuskokwim stocks through a front-end closure appears to be an effective strategy for maintaining biodiversity in the upper watershed while supporting basin-wide escapement </w:t>
+        <w:t xml:space="preserve">Protecting upper Kuskokwim stocks through a front-end closure appears to be an effective strategy for maintaining biodiversity in the upper watershed while supporting basin-wide escapement goals and harvest opportunities. However, the overall effectiveness of this strategy in sustaining stock diversity and balancing conservation with harvest depends not only on the protection provided to upper-watershed stocks during the closure, but also on how the closure affects overall harvest opportunity and harvest behavior once the fishery reopens. For example, a closure which protects a large proportion of upstream stocks by prohibiting harvest on a significant portion of the run may concentrate fishing pressure on later returning stocks. As a result, this shift in the temporal distribution of fishing pressure may impact weak downstream stocks as compared to the same harvest pressure distributed across the full migration window, thereby degrading biodiversity. Further, the timing of the front-end closure coincides with the preferred and traditional timing of </w:t>
       </w:r>
       <w:r>
         <w:rPr>
           <w:rFonts w:ascii="Garamond" w:hAnsi="Garamond"/>
         </w:rPr>
         <w:lastRenderedPageBreak/>
-        <w:t xml:space="preserve">goals and harvest opportunities. However, the overall effectiveness of this strategy in sustaining stock diversity and balancing conservation with harvest depends not only on the protection provided to upper-watershed stocks during the closure, but also on how the closure affects overall harvest opportunity and harvest behavior once the fishery reopens. For example, a closure which protects a large proportion of upstream stocks by prohibiting harvest on a significant portion of the run may concentrate fishing pressure on later returning stocks. As a result, this shift in the temporal distribution of fishing pressure may impact weak downstream stocks as compared to the same harvest pressure distributed across the full migration window, thereby degrading biodiversity. Further, the timing of the front-end closure coincides with the preferred and traditional timing of fishing for many communities in the lower Kuskokwim. An extended duration of this closure has the potential to further disrupt traditional fishing opportunities for these communities and cause further hardship to subsistence communities in the basin. The efficacy of management strategies such as front-end closures must therefore be evaluated in the context of ecosystem, fishery, and cultural dynamics to fully understand their role in maintaining basin-wide biodiversity. </w:t>
+        <w:t xml:space="preserve">fishing for many communities in the lower Kuskokwim. An extended duration of this closure has the potential to further disrupt traditional fishing opportunities for these communities and cause further hardship to subsistence communities in the basin. The efficacy of management strategies such as front-end closures must therefore be evaluated in the context of ecosystem, fishery, and cultural dynamics to fully understand their role in maintaining basin-wide biodiversity. </w:t>
       </w:r>
     </w:p>
     <w:p>
@@ -5074,7 +5424,14 @@
           <w:b w:val="0"/>
           <w:bCs w:val="0"/>
         </w:rPr>
-        <w:t xml:space="preserve">multiple dimensions of inter- and intra-species variation </w:t>
+        <w:t>multiple dimensions of inter- and intra-species variation which contribute to system-wide biodiversity.</w:t>
+      </w:r>
+      <w:r>
+        <w:rPr>
+          <w:rStyle w:val="Strong"/>
+          <w:rFonts w:ascii="Garamond" w:eastAsiaTheme="majorEastAsia" w:hAnsi="Garamond"/>
+        </w:rPr>
+        <w:t xml:space="preserve"> </w:t>
       </w:r>
       <w:r>
         <w:rPr>
@@ -5083,23 +5440,6 @@
           <w:b w:val="0"/>
           <w:bCs w:val="0"/>
         </w:rPr>
-        <w:lastRenderedPageBreak/>
-        <w:t>which contribute to system-wide biodiversity.</w:t>
-      </w:r>
-      <w:r>
-        <w:rPr>
-          <w:rStyle w:val="Strong"/>
-          <w:rFonts w:ascii="Garamond" w:eastAsiaTheme="majorEastAsia" w:hAnsi="Garamond"/>
-        </w:rPr>
-        <w:t xml:space="preserve"> </w:t>
-      </w:r>
-      <w:r>
-        <w:rPr>
-          <w:rStyle w:val="Strong"/>
-          <w:rFonts w:ascii="Garamond" w:eastAsiaTheme="majorEastAsia" w:hAnsi="Garamond"/>
-          <w:b w:val="0"/>
-          <w:bCs w:val="0"/>
-        </w:rPr>
         <w:t>D</w:t>
       </w:r>
       <w:r>
@@ -5137,7 +5477,14 @@
         <w:rPr>
           <w:rFonts w:ascii="Garamond" w:hAnsi="Garamond" w:cs="Times New Roman"/>
         </w:rPr>
-        <w:t xml:space="preserve">We thank the Alaska Department of Fish &amp; Game, particularly Sean Larson and Zachary Liller for coordinating otolith sampling at the Bethel Test Fishery and for feedback on the study design and manuscript. Funding for this work was provided by the Arctic-Yukon-Kuskokwim Sustainable Salmon Initiative. Joseph Spaeder of the AYK-SSI also provided feedback on the study design. We also thank the local community members who supported otolith removal and collection as well as the ONC fisheries program staff members who helped support data collection and distributed sampled fish to elders, disabled, and widowed community members. This work was made possible by the efforts of Dr. Sean Brennan, who was instrumental in the collection of these datasets and was motivated to push forward on the boundaries of using isotope-based methods to explore ecological processes in Alaska salmon. </w:t>
+        <w:t xml:space="preserve">We thank the Alaska Department of Fish &amp; Game, particularly Sean Larson and Zachary Liller for coordinating otolith sampling at the Bethel Test Fishery and for feedback on the study design and manuscript. Funding for this work was provided by the Arctic-Yukon-Kuskokwim Sustainable Salmon Initiative. Joseph Spaeder of the AYK-SSI also provided feedback on the study design. We also thank the local community members who supported otolith removal and collection as well as the ONC fisheries program staff members who helped support data collection and distributed sampled fish to elders, disabled, and widowed community members. This work was </w:t>
+      </w:r>
+      <w:r>
+        <w:rPr>
+          <w:rFonts w:ascii="Garamond" w:hAnsi="Garamond" w:cs="Times New Roman"/>
+        </w:rPr>
+        <w:lastRenderedPageBreak/>
+        <w:t xml:space="preserve">made possible by the efforts of Dr. Sean Brennan, who was instrumental in the collection of these datasets and was motivated to push forward on the boundaries of using isotope-based methods to explore ecological processes in Alaska salmon. </w:t>
       </w:r>
     </w:p>
     <w:p>
@@ -5287,7 +5634,6 @@
         <w:rPr>
           <w:rFonts w:ascii="Garamond" w:hAnsi="Garamond"/>
         </w:rPr>
-        <w:lastRenderedPageBreak/>
         <w:t xml:space="preserve">Bolnick, D. I., Amarasekare, P., Araújo, M. S., Bürger, R., Levine, J. M., Novak, M., Rudolf, V. H. W., Schreiber, S. J., Urban, M. C., &amp; Vasseur, D. A. (2011). Why intraspecific trait variation matters in community ecology. </w:t>
       </w:r>
       <w:r>
@@ -5372,6 +5718,7 @@
         <w:rPr>
           <w:rFonts w:ascii="Garamond" w:hAnsi="Garamond"/>
         </w:rPr>
+        <w:lastRenderedPageBreak/>
         <w:t xml:space="preserve">Brennan, S. R., Schindler, D. E., Cline, T. J., Walsworth, T. E., Buck, G., &amp; Fernandez, D. P. (2019). Shifting habitat mosaics and fish production across river basins. </w:t>
       </w:r>
       <w:r>
@@ -5610,7 +5957,6 @@
         <w:rPr>
           <w:rFonts w:ascii="Garamond" w:hAnsi="Garamond"/>
         </w:rPr>
-        <w:lastRenderedPageBreak/>
         <w:t xml:space="preserve">Chittaro, P., Hegg, J., Fuhrman, A., Robichaux, D., Doung, R., Beckman, B., Fisher, C., Vervoort, J., &amp; Kennedy, B. (2023). The incorporation of environmentally derived 87Sr/86Sr and Sr/Ca in early otolith formation of Chinook salmon. </w:t>
       </w:r>
       <w:r>
@@ -5689,6 +6035,7 @@
         <w:rPr>
           <w:rFonts w:ascii="Garamond" w:hAnsi="Garamond"/>
         </w:rPr>
+        <w:lastRenderedPageBreak/>
         <w:t xml:space="preserve">Clark, S. C., Tanner, T. L., Sethi, S. A., Bentley, K. T., &amp; Schindler, D. E. (2015). Migration Timing of Adult Chinook Salmon into the Togiak River, Alaska, Watershed: Is There Evidence for Stock Structure? </w:t>
       </w:r>
       <w:r>
@@ -5885,7 +6232,6 @@
         <w:rPr>
           <w:rFonts w:ascii="Garamond" w:hAnsi="Garamond"/>
         </w:rPr>
-        <w:lastRenderedPageBreak/>
         <w:t xml:space="preserve">French, D. W., Schindler, D. E., Brennan, S. R., &amp; Whited, D. (2020). Headwater Catchments Govern Biogeochemistry in America’s Largest Free-Flowing River Network. </w:t>
       </w:r>
       <w:r>
@@ -5928,7 +6274,14 @@
         <w:rPr>
           <w:rFonts w:ascii="Garamond" w:hAnsi="Garamond"/>
         </w:rPr>
-        <w:t xml:space="preserve">Griffiths, J. R., Schindler, D. E., Armstrong, J. B., Scheuerell, M. D., Whited, D. C., Clark, R. A., Hilborn, R., Holt, C. A., Lindley, S. T., Stanford, J. A., &amp; Volk, E. C. (2014). Performance of salmon fishery portfolios across western North America. </w:t>
+        <w:t xml:space="preserve">Griffiths, J. R., Schindler, D. E., Armstrong, J. B., Scheuerell, M. D., Whited, D. C., Clark, R. A., Hilborn, R., Holt, C. A., Lindley, S. T., Stanford, J. A., &amp; Volk, E. C. (2014). Performance of </w:t>
+      </w:r>
+      <w:r>
+        <w:rPr>
+          <w:rFonts w:ascii="Garamond" w:hAnsi="Garamond"/>
+        </w:rPr>
+        <w:lastRenderedPageBreak/>
+        <w:t xml:space="preserve">salmon fishery portfolios across western North America. </w:t>
       </w:r>
       <w:r>
         <w:rPr>
@@ -6152,7 +6505,6 @@
         <w:rPr>
           <w:rFonts w:ascii="Garamond" w:hAnsi="Garamond"/>
         </w:rPr>
-        <w:lastRenderedPageBreak/>
         <w:t xml:space="preserve">Lipka, C., &amp; Elison, T. (2015). </w:t>
       </w:r>
       <w:r>
@@ -6223,7 +6575,14 @@
         <w:rPr>
           <w:rFonts w:ascii="Garamond" w:hAnsi="Garamond"/>
         </w:rPr>
-        <w:t xml:space="preserve">Makhlouf, B., Cline, T. J., Fernandez, D., Seeb, L., Lee, E., Gilk-Baumer, S., Whited, D., Zimmerman, C. E., &amp; Schindler, D. E. (2025). Combining genetic and isotope frameworks improves reconstruction of fish provenance across riverscapes. </w:t>
+        <w:t xml:space="preserve">Makhlouf, B., Cline, T. J., Fernandez, D., Seeb, L., Lee, E., Gilk-Baumer, S., Whited, D., Zimmerman, C. E., &amp; Schindler, D. E. (2025). Combining genetic and isotope frameworks </w:t>
+      </w:r>
+      <w:r>
+        <w:rPr>
+          <w:rFonts w:ascii="Garamond" w:hAnsi="Garamond"/>
+        </w:rPr>
+        <w:lastRenderedPageBreak/>
+        <w:t xml:space="preserve">improves reconstruction of fish provenance across riverscapes. </w:t>
       </w:r>
       <w:r>
         <w:rPr>
@@ -6461,7 +6820,6 @@
         <w:rPr>
           <w:rFonts w:ascii="Garamond" w:hAnsi="Garamond"/>
         </w:rPr>
-        <w:lastRenderedPageBreak/>
         <w:t xml:space="preserve">Schindler, D. E., Armstrong, J. B., &amp; Reed, T. E. (2015). The portfolio concept in ecology and evolution. </w:t>
       </w:r>
       <w:r>
@@ -6552,6 +6910,7 @@
           <w:rFonts w:ascii="Garamond" w:hAnsi="Garamond"/>
           <w:lang w:val="fr-FR"/>
         </w:rPr>
+        <w:lastRenderedPageBreak/>
         <w:t xml:space="preserve">Smith, N. J., &amp; Liller, Z. W. (2017a). </w:t>
       </w:r>
       <w:r>
@@ -6749,7 +7108,6 @@
         <w:rPr>
           <w:rFonts w:ascii="Garamond" w:hAnsi="Garamond"/>
         </w:rPr>
-        <w:lastRenderedPageBreak/>
         <w:t xml:space="preserve">Ver Hoef, J. M., &amp; Peterson, E. E. (2010). A Moving Average Approach for Spatial Statistical Models of Stream Networks. </w:t>
       </w:r>
       <w:r>
@@ -6820,6 +7178,7 @@
         <w:rPr>
           <w:rFonts w:ascii="Garamond" w:hAnsi="Garamond"/>
         </w:rPr>
+        <w:lastRenderedPageBreak/>
         <w:t xml:space="preserve">Zimmerman, C. E., &amp; Reeves, G. H. (2002). Identification of Steelhead and Resident Rainbow Trout Progeny in the Deschutes River, Oregon, Revealed with Otolith Microchemistry. </w:t>
       </w:r>
       <w:r>
@@ -6882,7 +7241,7 @@
 
 <file path=word/comments.xml><?xml version="1.0" encoding="utf-8"?>
 <w:comments xmlns:wpc="http://schemas.microsoft.com/office/word/2010/wordprocessingCanvas" xmlns:cx="http://schemas.microsoft.com/office/drawing/2014/chartex" xmlns:cx1="http://schemas.microsoft.com/office/drawing/2015/9/8/chartex" xmlns:cx2="http://schemas.microsoft.com/office/drawing/2015/10/21/chartex" xmlns:cx3="http://schemas.microsoft.com/office/drawing/2016/5/9/chartex" xmlns:cx4="http://schemas.microsoft.com/office/drawing/2016/5/10/chartex" xmlns:cx5="http://schemas.microsoft.com/office/drawing/2016/5/11/chartex" xmlns:cx6="http://schemas.microsoft.com/office/drawing/2016/5/12/chartex" xmlns:cx7="http://schemas.microsoft.com/office/drawing/2016/5/13/chartex" xmlns:cx8="http://schemas.microsoft.com/office/drawing/2016/5/14/chartex" xmlns:mc="http://schemas.openxmlformats.org/markup-compatibility/2006" xmlns:aink="http://schemas.microsoft.com/office/drawing/2016/ink" xmlns:am3d="http://schemas.microsoft.com/office/drawing/2017/model3d" xmlns:o="urn:schemas-microsoft-com:office:office" xmlns:oel="http://schemas.microsoft.com/office/2019/extlst" xmlns:r="http://schemas.openxmlformats.org/officeDocument/2006/relationships" xmlns:m="http://schemas.openxmlformats.org/officeDocument/2006/math" xmlns:v="urn:schemas-microsoft-com:vml" xmlns:wp14="http://schemas.microsoft.com/office/word/2010/wordprocessingDrawing" xmlns:wp="http://schemas.openxmlformats.org/drawingml/2006/wordprocessingDrawing" xmlns:w10="urn:schemas-microsoft-com:office:word" xmlns:w="http://schemas.openxmlformats.org/wordprocessingml/2006/main" xmlns:w14="http://schemas.microsoft.com/office/word/2010/wordml" xmlns:w15="http://schemas.microsoft.com/office/word/2012/wordml" xmlns:w16cex="http://schemas.microsoft.com/office/word/2018/wordml/cex" xmlns:w16cid="http://schemas.microsoft.com/office/word/2016/wordml/cid" xmlns:w16="http://schemas.microsoft.com/office/word/2018/wordml" xmlns:w16du="http://schemas.microsoft.com/office/word/2023/wordml/word16du" xmlns:w16sdtdh="http://schemas.microsoft.com/office/word/2020/wordml/sdtdatahash" xmlns:w16sdtfl="http://schemas.microsoft.com/office/word/2024/wordml/sdtformatlock" xmlns:w16se="http://schemas.microsoft.com/office/word/2015/wordml/symex" xmlns:wpg="http://schemas.microsoft.com/office/word/2010/wordprocessingGroup" xmlns:wpi="http://schemas.microsoft.com/office/word/2010/wordprocessingInk" xmlns:wne="http://schemas.microsoft.com/office/word/2006/wordml" xmlns:wps="http://schemas.microsoft.com/office/word/2010/wordprocessingShape" mc:Ignorable="w14 w15 w16se w16cid w16 w16cex w16sdtdh w16sdtfl w16du wp14">
-  <w:comment w:id="48" w:author="Benjamin J. Makhlouf" w:date="2026-06-18T14:12:00Z" w:initials="BM">
+  <w:comment w:id="68" w:author="Benjamin J. Makhlouf" w:date="2026-06-18T14:12:00Z" w:initials="BM">
     <w:p>
       <w:pPr>
         <w:pStyle w:val="CommentText"/>

</xml_diff>